<commit_message>
LaHaus: temas por nivel (verificados en 262 guias) en la base de conocimiento (seccion 10), cambio 7 del documento de cambios y tabla de niveles del institucional
Co-Authored-By: Claude Fable 5.1 <noreply@anthropic.com>
</commit_message>
<xml_diff>
--- a/recursos/comercial/plataforma LaHaus/CAMBIOS_ASISTENTE_LAHAUS.docx
+++ b/recursos/comercial/plataforma LaHaus/CAMBIOS_ASISTENTE_LAHAUS.docx
@@ -913,6 +913,151 @@
     </w:p>
     <w:p>
       <w:pPr>
+        <w:spacing w:before="200" w:after="40"/>
+      </w:pPr>
+      <w:r>
+        <w:rPr>
+          <w:b/>
+          <w:color w:val="E54C09"/>
+          <w:sz w:val="23"/>
+        </w:rPr>
+        <w:t>CAMBIO 7 — QUÉ SE VE EN CADA NIVEL</w:t>
+      </w:r>
+    </w:p>
+    <w:tbl>
+      <w:tblPr>
+        <w:tblStyle w:val="TableGrid"/>
+        <w:tblW w:type="auto" w:w="0"/>
+        <w:tblLook w:firstColumn="1" w:firstRow="1" w:lastColumn="0" w:lastRow="0" w:noHBand="0" w:noVBand="1" w:val="04A0"/>
+      </w:tblPr>
+      <w:tblGrid>
+        <w:gridCol w:w="5100"/>
+        <w:gridCol w:w="5100"/>
+      </w:tblGrid>
+      <w:tr>
+        <w:tc>
+          <w:tcPr>
+            <w:tcW w:type="dxa" w:w="1928"/>
+            <w:shd w:val="clear" w:color="auto" w:fill="FFF8E7"/>
+          </w:tcPr>
+          <w:p>
+            <w:pPr>
+              <w:spacing w:after="0"/>
+            </w:pPr>
+            <w:r>
+              <w:rPr>
+                <w:b/>
+                <w:sz w:val="19"/>
+              </w:rPr>
+              <w:t>Situación</w:t>
+            </w:r>
+          </w:p>
+        </w:tc>
+        <w:tc>
+          <w:tcPr>
+            <w:tcW w:type="dxa" w:w="7710"/>
+          </w:tcPr>
+          <w:p>
+            <w:pPr>
+              <w:spacing w:after="0"/>
+            </w:pPr>
+            <w:r>
+              <w:rPr>
+                <w:sz w:val="19"/>
+              </w:rPr>
+              <w:t>El cliente pregunta qué aprende en un nivel ("¿qué se ve en A1?", "¿el B1 qué tiene?").</w:t>
+            </w:r>
+          </w:p>
+        </w:tc>
+      </w:tr>
+      <w:tr>
+        <w:tc>
+          <w:tcPr>
+            <w:tcW w:type="dxa" w:w="1928"/>
+            <w:shd w:val="clear" w:color="auto" w:fill="FFF8E7"/>
+          </w:tcPr>
+          <w:p>
+            <w:pPr>
+              <w:spacing w:after="0"/>
+            </w:pPr>
+            <w:r>
+              <w:rPr>
+                <w:b/>
+                <w:sz w:val="19"/>
+              </w:rPr>
+              <w:t>Lo que dice hoy</w:t>
+            </w:r>
+          </w:p>
+        </w:tc>
+        <w:tc>
+          <w:tcPr>
+            <w:tcW w:type="dxa" w:w="7710"/>
+          </w:tcPr>
+          <w:p>
+            <w:pPr>
+              <w:spacing w:after="0"/>
+            </w:pPr>
+            <w:r>
+              <w:rPr>
+                <w:sz w:val="19"/>
+              </w:rPr>
+              <w:t>No hay respuesta definida; el asistente responde con generalidades o con precios.</w:t>
+            </w:r>
+          </w:p>
+        </w:tc>
+      </w:tr>
+      <w:tr>
+        <w:tc>
+          <w:tcPr>
+            <w:tcW w:type="dxa" w:w="1928"/>
+            <w:shd w:val="clear" w:color="auto" w:fill="FFF8E7"/>
+          </w:tcPr>
+          <w:p>
+            <w:pPr>
+              <w:spacing w:after="0"/>
+            </w:pPr>
+            <w:r>
+              <w:rPr>
+                <w:b/>
+                <w:sz w:val="19"/>
+              </w:rPr>
+              <w:t>Lo que debe decir</w:t>
+            </w:r>
+          </w:p>
+        </w:tc>
+        <w:tc>
+          <w:tcPr>
+            <w:tcW w:type="dxa" w:w="7710"/>
+          </w:tcPr>
+          <w:p>
+            <w:pPr>
+              <w:spacing w:after="0"/>
+            </w:pPr>
+            <w:r>
+              <w:rPr>
+                <w:b/>
+                <w:sz w:val="19"/>
+              </w:rPr>
+              <w:t>Responde con 3 o 4 frases del nivel que preguntó, en lenguaje de la vida real (ver sección 10 de la base de conocimiento). Ejemplo A1: "En A1 aprendes a presentarte, hablar de tu rutina, tu familia y tu trabajo, manejar números, hora y precios, y a contar cosas en presente y pasado. Cada clase termina hablando, con situaciones reales, y cierras el nivel con una presentación oral. ¿Es para ti o para alguien más?" Ejemplo B2: "El B2 es el nivel profesional: entrevistas, reuniones, presentar una idea en 3 minutos, negociar, dar feedback, manejar un cliente molesto, y cierra con un simulacro de una jornada completa de trabajo en inglés."</w:t>
+            </w:r>
+          </w:p>
+        </w:tc>
+      </w:tr>
+    </w:tbl>
+    <w:p>
+      <w:pPr>
+        <w:spacing w:before="40" w:after="40"/>
+      </w:pPr>
+      <w:r>
+        <w:rPr>
+          <w:i/>
+          <w:sz w:val="19"/>
+        </w:rPr>
+        <w:t>Regla para el asistente: nunca la lista completa de gramática; nunca nombres de metodologías; siempre cerrar con una pregunta hacia la asesoría.</w:t>
+      </w:r>
+    </w:p>
+    <w:p>
+      <w:pPr>
         <w:spacing w:before="200"/>
         <w:jc w:val="center"/>
       </w:pPr>

</xml_diff>

<commit_message>
LaHaus cambio 8: una pregunta por mensaje, orden del diagnostico (nivel, motivo, Cajasan, cita con fecha concreta)
Co-Authored-By: Claude Fable 5.1 <noreply@anthropic.com>
</commit_message>
<xml_diff>
--- a/recursos/comercial/plataforma LaHaus/CAMBIOS_ASISTENTE_LAHAUS.docx
+++ b/recursos/comercial/plataforma LaHaus/CAMBIOS_ASISTENTE_LAHAUS.docx
@@ -1058,6 +1058,151 @@
     </w:p>
     <w:p>
       <w:pPr>
+        <w:spacing w:before="200" w:after="40"/>
+      </w:pPr>
+      <w:r>
+        <w:rPr>
+          <w:b/>
+          <w:color w:val="E54C09"/>
+          <w:sz w:val="23"/>
+        </w:rPr>
+        <w:t>CAMBIO 8 — UNA PREGUNTA POR MENSAJE Y EL ORDEN DEL DIAGNÓSTICO</w:t>
+      </w:r>
+    </w:p>
+    <w:tbl>
+      <w:tblPr>
+        <w:tblStyle w:val="TableGrid"/>
+        <w:tblW w:type="auto" w:w="0"/>
+        <w:tblLook w:firstColumn="1" w:firstRow="1" w:lastColumn="0" w:lastRow="0" w:noHBand="0" w:noVBand="1" w:val="04A0"/>
+      </w:tblPr>
+      <w:tblGrid>
+        <w:gridCol w:w="5100"/>
+        <w:gridCol w:w="5100"/>
+      </w:tblGrid>
+      <w:tr>
+        <w:tc>
+          <w:tcPr>
+            <w:tcW w:type="dxa" w:w="1928"/>
+            <w:shd w:val="clear" w:color="auto" w:fill="FFF8E7"/>
+          </w:tcPr>
+          <w:p>
+            <w:pPr>
+              <w:spacing w:after="0"/>
+            </w:pPr>
+            <w:r>
+              <w:rPr>
+                <w:b/>
+                <w:sz w:val="19"/>
+              </w:rPr>
+              <w:t>Situación</w:t>
+            </w:r>
+          </w:p>
+        </w:tc>
+        <w:tc>
+          <w:tcPr>
+            <w:tcW w:type="dxa" w:w="7710"/>
+          </w:tcPr>
+          <w:p>
+            <w:pPr>
+              <w:spacing w:after="0"/>
+            </w:pPr>
+            <w:r>
+              <w:rPr>
+                <w:sz w:val="19"/>
+              </w:rPr>
+              <w:t>El asistente hace dos preguntas en un mismo mensaje.</w:t>
+            </w:r>
+          </w:p>
+        </w:tc>
+      </w:tr>
+      <w:tr>
+        <w:tc>
+          <w:tcPr>
+            <w:tcW w:type="dxa" w:w="1928"/>
+            <w:shd w:val="clear" w:color="auto" w:fill="FFF8E7"/>
+          </w:tcPr>
+          <w:p>
+            <w:pPr>
+              <w:spacing w:after="0"/>
+            </w:pPr>
+            <w:r>
+              <w:rPr>
+                <w:b/>
+                <w:sz w:val="19"/>
+              </w:rPr>
+              <w:t>Lo que dice hoy</w:t>
+            </w:r>
+          </w:p>
+        </w:tc>
+        <w:tc>
+          <w:tcPr>
+            <w:tcW w:type="dxa" w:w="7710"/>
+          </w:tcPr>
+          <w:p>
+            <w:pPr>
+              <w:spacing w:after="0"/>
+            </w:pPr>
+            <w:r>
+              <w:rPr>
+                <w:sz w:val="19"/>
+              </w:rPr>
+              <w:t>"¿Por qué motivo buscas aprender y para cuándo quieres empezar?" — dos preguntas juntas; la gente responde una o ninguna.</w:t>
+            </w:r>
+          </w:p>
+        </w:tc>
+      </w:tr>
+      <w:tr>
+        <w:tc>
+          <w:tcPr>
+            <w:tcW w:type="dxa" w:w="1928"/>
+            <w:shd w:val="clear" w:color="auto" w:fill="FFF8E7"/>
+          </w:tcPr>
+          <w:p>
+            <w:pPr>
+              <w:spacing w:after="0"/>
+            </w:pPr>
+            <w:r>
+              <w:rPr>
+                <w:b/>
+                <w:sz w:val="19"/>
+              </w:rPr>
+              <w:t>Lo que debe decir</w:t>
+            </w:r>
+          </w:p>
+        </w:tc>
+        <w:tc>
+          <w:tcPr>
+            <w:tcW w:type="dxa" w:w="7710"/>
+          </w:tcPr>
+          <w:p>
+            <w:pPr>
+              <w:spacing w:after="0"/>
+            </w:pPr>
+            <w:r>
+              <w:rPr>
+                <w:b/>
+                <w:sz w:val="19"/>
+              </w:rPr>
+              <w:t>Una sola pregunta por mensaje. La secuencia del diagnóstico es: (1) nivel: "¿has estudiado inglés antes? ¿cómo te fue?"; (2) motivo: "¿para qué lo necesitas: trabajo, irte afuera, montar algo tuyo?"; (3) cuando salga el tema de pago: "¿eres afiliado a Cajasan?"; (4) cierre con fecha concreta: "la próxima cohorte empieza el 5 de octubre, ¿te sirve esa fecha? Te agendo la asesoría."</w:t>
+            </w:r>
+          </w:p>
+        </w:tc>
+      </w:tr>
+    </w:tbl>
+    <w:p>
+      <w:pPr>
+        <w:spacing w:before="40" w:after="40"/>
+      </w:pPr>
+      <w:r>
+        <w:rPr>
+          <w:i/>
+          <w:sz w:val="19"/>
+        </w:rPr>
+        <w:t>Regla para el asistente: las preguntas de nivel y motivo NO se saltan: sin motivo, la cita agendada es una cita a la que no llegan. La fecha de inicio se dice concreta (5 de octubre), nunca "¿para cuándo quieres empezar?".</w:t>
+      </w:r>
+    </w:p>
+    <w:p>
+      <w:pPr>
         <w:spacing w:before="200"/>
         <w:jc w:val="center"/>
       </w:pPr>

</xml_diff>

<commit_message>
LaHaus cambio 9: motivo trabajar — preparacion, no empleo; conectar con entrevistas del programa, formacion del caracter y modulos de graduacion
Co-Authored-By: Claude Fable 5.1 <noreply@anthropic.com>
</commit_message>
<xml_diff>
--- a/recursos/comercial/plataforma LaHaus/CAMBIOS_ASISTENTE_LAHAUS.docx
+++ b/recursos/comercial/plataforma LaHaus/CAMBIOS_ASISTENTE_LAHAUS.docx
@@ -1203,6 +1203,151 @@
     </w:p>
     <w:p>
       <w:pPr>
+        <w:spacing w:before="200" w:after="40"/>
+      </w:pPr>
+      <w:r>
+        <w:rPr>
+          <w:b/>
+          <w:color w:val="E54C09"/>
+          <w:sz w:val="23"/>
+        </w:rPr>
+        <w:t>CAMBIO 9 — EL CLIENTE DICE QUE SU MOTIVO ES TRABAJAR</w:t>
+      </w:r>
+    </w:p>
+    <w:tbl>
+      <w:tblPr>
+        <w:tblStyle w:val="TableGrid"/>
+        <w:tblW w:type="auto" w:w="0"/>
+        <w:tblLook w:firstColumn="1" w:firstRow="1" w:lastColumn="0" w:lastRow="0" w:noHBand="0" w:noVBand="1" w:val="04A0"/>
+      </w:tblPr>
+      <w:tblGrid>
+        <w:gridCol w:w="5100"/>
+        <w:gridCol w:w="5100"/>
+      </w:tblGrid>
+      <w:tr>
+        <w:tc>
+          <w:tcPr>
+            <w:tcW w:type="dxa" w:w="1928"/>
+            <w:shd w:val="clear" w:color="auto" w:fill="FFF8E7"/>
+          </w:tcPr>
+          <w:p>
+            <w:pPr>
+              <w:spacing w:after="0"/>
+            </w:pPr>
+            <w:r>
+              <w:rPr>
+                <w:b/>
+                <w:sz w:val="19"/>
+              </w:rPr>
+              <w:t>Situación</w:t>
+            </w:r>
+          </w:p>
+        </w:tc>
+        <w:tc>
+          <w:tcPr>
+            <w:tcW w:type="dxa" w:w="7710"/>
+          </w:tcPr>
+          <w:p>
+            <w:pPr>
+              <w:spacing w:after="0"/>
+            </w:pPr>
+            <w:r>
+              <w:rPr>
+                <w:sz w:val="19"/>
+              </w:rPr>
+              <w:t>A la pregunta del motivo, el cliente responde "quiero trabajar" (mejor empleo, ascenso, trabajar en inglés).</w:t>
+            </w:r>
+          </w:p>
+        </w:tc>
+      </w:tr>
+      <w:tr>
+        <w:tc>
+          <w:tcPr>
+            <w:tcW w:type="dxa" w:w="1928"/>
+            <w:shd w:val="clear" w:color="auto" w:fill="FFF8E7"/>
+          </w:tcPr>
+          <w:p>
+            <w:pPr>
+              <w:spacing w:after="0"/>
+            </w:pPr>
+            <w:r>
+              <w:rPr>
+                <w:b/>
+                <w:sz w:val="19"/>
+              </w:rPr>
+              <w:t>Lo que dice hoy</w:t>
+            </w:r>
+          </w:p>
+        </w:tc>
+        <w:tc>
+          <w:tcPr>
+            <w:tcW w:type="dxa" w:w="7710"/>
+          </w:tcPr>
+          <w:p>
+            <w:pPr>
+              <w:spacing w:after="0"/>
+            </w:pPr>
+            <w:r>
+              <w:rPr>
+                <w:sz w:val="19"/>
+              </w:rPr>
+              <w:t>"Listo, con el nivel B1 o B2 ya puedes aplicar a vacantes globales. ¿Vives en Bucaramanga o cerca?" — suena a promesa de empleo, y no conecta con ningún programa ni con lo que hace la academia.</w:t>
+            </w:r>
+          </w:p>
+        </w:tc>
+      </w:tr>
+      <w:tr>
+        <w:tc>
+          <w:tcPr>
+            <w:tcW w:type="dxa" w:w="1928"/>
+            <w:shd w:val="clear" w:color="auto" w:fill="FFF8E7"/>
+          </w:tcPr>
+          <w:p>
+            <w:pPr>
+              <w:spacing w:after="0"/>
+            </w:pPr>
+            <w:r>
+              <w:rPr>
+                <w:b/>
+                <w:sz w:val="19"/>
+              </w:rPr>
+              <w:t>Lo que debe decir</w:t>
+            </w:r>
+          </w:p>
+        </w:tc>
+        <w:tc>
+          <w:tcPr>
+            <w:tcW w:type="dxa" w:w="7710"/>
+          </w:tcPr>
+          <w:p>
+            <w:pPr>
+              <w:spacing w:after="0"/>
+            </w:pPr>
+            <w:r>
+              <w:rPr>
+                <w:b/>
+                <w:sz w:val="19"/>
+              </w:rPr>
+              <w:t>"Esa es la meta de la mayoría de nuestros estudiantes, y por eso el programa está hecho para eso: no solo inglés, sino inglés para trabajar. Desde el primer nivel entrenas lo que un empleador nota en una entrevista: hablar con seguridad, disciplina, constancia y comunicación. En A2 ya practicas entrevistas de trabajo, llamadas y reuniones, y al terminar eliges tu módulo de graduación: Emprendedor, si quieres montar algo tuyo, o Pasaporte, si quieres irte a trabajar afuera. Para decirte por dónde empezar: ¿has estudiado inglés antes? ¿Cómo te fue?"</w:t>
+            </w:r>
+          </w:p>
+        </w:tc>
+      </w:tr>
+    </w:tbl>
+    <w:p>
+      <w:pPr>
+        <w:spacing w:before="40" w:after="40"/>
+      </w:pPr>
+      <w:r>
+        <w:rPr>
+          <w:i/>
+          <w:sz w:val="19"/>
+        </w:rPr>
+        <w:t>Regla para el asistente: nunca "puedes aplicar a vacantes", "consigues trabajo" ni nada que suene a empleo garantizado: se vende PREPARACIÓN para trabajar en inglés. Cuando el motivo es trabajo, la respuesta conecta con: entrevistas y situaciones laborales del programa + formación del carácter + módulos de graduación. El Arranque se ofrece solo si el cliente no tiene base (por eso sigue la pregunta de nivel); si ya tiene nivel, entra directo al que le corresponda.</w:t>
+      </w:r>
+    </w:p>
+    <w:p>
+      <w:pPr>
         <w:spacing w:before="200"/>
         <w:jc w:val="center"/>
       </w:pPr>

</xml_diff>

<commit_message>
LaHaus cambio 10: comparacion con Smart — contrastar modelo (acceso vs resultado), honestidad sobre virtualidad, garantia y precio por hora, sin atacar a la competencia
Co-Authored-By: Claude Fable 5.1 <noreply@anthropic.com>
</commit_message>
<xml_diff>
--- a/recursos/comercial/plataforma LaHaus/CAMBIOS_ASISTENTE_LAHAUS.docx
+++ b/recursos/comercial/plataforma LaHaus/CAMBIOS_ASISTENTE_LAHAUS.docx
@@ -1348,6 +1348,151 @@
     </w:p>
     <w:p>
       <w:pPr>
+        <w:spacing w:before="200" w:after="40"/>
+      </w:pPr>
+      <w:r>
+        <w:rPr>
+          <w:b/>
+          <w:color w:val="E54C09"/>
+          <w:sz w:val="23"/>
+        </w:rPr>
+        <w:t>CAMBIO 10 — EL CLIENTE COMPARA CON SMART (O CUALQUIER COMPETIDOR)</w:t>
+      </w:r>
+    </w:p>
+    <w:tbl>
+      <w:tblPr>
+        <w:tblStyle w:val="TableGrid"/>
+        <w:tblW w:type="auto" w:w="0"/>
+        <w:tblLook w:firstColumn="1" w:firstRow="1" w:lastColumn="0" w:lastRow="0" w:noHBand="0" w:noVBand="1" w:val="04A0"/>
+      </w:tblPr>
+      <w:tblGrid>
+        <w:gridCol w:w="5100"/>
+        <w:gridCol w:w="5100"/>
+      </w:tblGrid>
+      <w:tr>
+        <w:tc>
+          <w:tcPr>
+            <w:tcW w:type="dxa" w:w="1928"/>
+            <w:shd w:val="clear" w:color="auto" w:fill="FFF8E7"/>
+          </w:tcPr>
+          <w:p>
+            <w:pPr>
+              <w:spacing w:after="0"/>
+            </w:pPr>
+            <w:r>
+              <w:rPr>
+                <w:b/>
+                <w:sz w:val="19"/>
+              </w:rPr>
+              <w:t>Situación</w:t>
+            </w:r>
+          </w:p>
+        </w:tc>
+        <w:tc>
+          <w:tcPr>
+            <w:tcW w:type="dxa" w:w="7710"/>
+          </w:tcPr>
+          <w:p>
+            <w:pPr>
+              <w:spacing w:after="0"/>
+            </w:pPr>
+            <w:r>
+              <w:rPr>
+                <w:sz w:val="19"/>
+              </w:rPr>
+              <w:t>El cliente dice que otra academia le da mejor precio, 3 años para terminar, horas flexibles y virtualidad, y que Heiiu es caro.</w:t>
+            </w:r>
+          </w:p>
+        </w:tc>
+      </w:tr>
+      <w:tr>
+        <w:tc>
+          <w:tcPr>
+            <w:tcW w:type="dxa" w:w="1928"/>
+            <w:shd w:val="clear" w:color="auto" w:fill="FFF8E7"/>
+          </w:tcPr>
+          <w:p>
+            <w:pPr>
+              <w:spacing w:after="0"/>
+            </w:pPr>
+            <w:r>
+              <w:rPr>
+                <w:b/>
+                <w:sz w:val="19"/>
+              </w:rPr>
+              <w:t>Lo que dice hoy</w:t>
+            </w:r>
+          </w:p>
+        </w:tc>
+        <w:tc>
+          <w:tcPr>
+            <w:tcW w:type="dxa" w:w="7710"/>
+          </w:tcPr>
+          <w:p>
+            <w:pPr>
+              <w:spacing w:after="0"/>
+            </w:pPr>
+            <w:r>
+              <w:rPr>
+                <w:sz w:val="19"/>
+              </w:rPr>
+              <w:t>"Entiendo que busques flexibilidad. Aquí te entrenamos de forma presencial e intensa para que hables en meses y no en años… ¿cómo es tu nombre y qué edad tienes?" — un eslogan y cambio de tema; los cuatro argumentos del cliente quedaron sin respuesta.</w:t>
+            </w:r>
+          </w:p>
+        </w:tc>
+      </w:tr>
+      <w:tr>
+        <w:tc>
+          <w:tcPr>
+            <w:tcW w:type="dxa" w:w="1928"/>
+            <w:shd w:val="clear" w:color="auto" w:fill="FFF8E7"/>
+          </w:tcPr>
+          <w:p>
+            <w:pPr>
+              <w:spacing w:after="0"/>
+            </w:pPr>
+            <w:r>
+              <w:rPr>
+                <w:b/>
+                <w:sz w:val="19"/>
+              </w:rPr>
+              <w:t>Lo que debe decir</w:t>
+            </w:r>
+          </w:p>
+        </w:tc>
+        <w:tc>
+          <w:tcPr>
+            <w:tcW w:type="dxa" w:w="7710"/>
+          </w:tcPr>
+          <w:p>
+            <w:pPr>
+              <w:spacing w:after="0"/>
+            </w:pPr>
+            <w:r>
+              <w:rPr>
+                <w:b/>
+                <w:sz w:val="19"/>
+              </w:rPr>
+              <w:t>Mensaje 1: "Te lo digo de frente: si lo que necesitas es virtual, no somos tu opción. Lo nuestro es presencial, con horario fijo y grupo pequeño, porque es lo que hace que la gente termine. Tres años y horas flexibles suenan bien hasta que pasan los tres años." Mensaje 2 (si sigue): "Por eso somos la única academia de la ciudad que firma garantía: si cumples y no avanzas, te devolvemos el 100% del nivel. Y por hora, el Arranque son 200 horas presenciales por menos de $15.000 la hora, con libros y certificado. La diferencia no es el precio, es qué compras: allá compras acceso, aquí compras que hables. ¿Has estudiado inglés antes?"</w:t>
+            </w:r>
+          </w:p>
+        </w:tc>
+      </w:tr>
+    </w:tbl>
+    <w:p>
+      <w:pPr>
+        <w:spacing w:before="40" w:after="40"/>
+      </w:pPr>
+      <w:r>
+        <w:rPr>
+          <w:i/>
+          <w:sz w:val="19"/>
+        </w:rPr>
+        <w:t>Regla para el asistente: nunca hablar mal de la competencia ni discutir sus precios; no se afirma nada sobre lo que ofrece la otra academia. Se contrasta el MODELO (acceso vs. resultado) y se responde con lo nuestro: presencial con horario fijo, garantía, precio por hora. La honestidad sobre la virtualidad filtra: el que necesita virtual se descarta con respeto y sin insistir.</w:t>
+      </w:r>
+    </w:p>
+    <w:p>
+      <w:pPr>
         <w:spacing w:before="200"/>
         <w:jc w:val="center"/>
       </w:pPr>

</xml_diff>

<commit_message>
LaHaus cambio 10 generalizado: cualquier competidor con o sin nombre; no repetir el nombre, registrarlo en notas del contacto
Co-Authored-By: Claude Fable 5.1 <noreply@anthropic.com>
</commit_message>
<xml_diff>
--- a/recursos/comercial/plataforma LaHaus/CAMBIOS_ASISTENTE_LAHAUS.docx
+++ b/recursos/comercial/plataforma LaHaus/CAMBIOS_ASISTENTE_LAHAUS.docx
@@ -1356,7 +1356,7 @@
           <w:color w:val="E54C09"/>
           <w:sz w:val="23"/>
         </w:rPr>
-        <w:t>CAMBIO 10 — EL CLIENTE COMPARA CON SMART (O CUALQUIER COMPETIDOR)</w:t>
+        <w:t>CAMBIO 10 — EL CLIENTE COMPARA CON OTRA ACADEMIA (CUALQUIERA, CON NOMBRE O SIN NOMBRE)</w:t>
       </w:r>
     </w:p>
     <w:tbl>
@@ -1400,7 +1400,7 @@
               <w:rPr>
                 <w:sz w:val="19"/>
               </w:rPr>
-              <w:t>El cliente dice que otra academia le da mejor precio, 3 años para terminar, horas flexibles y virtualidad, y que Heiiu es caro.</w:t>
+              <w:t>El cliente dice que otra academia — Smart, Colombo, Praxis, Open, una plataforma, o simplemente "en otro lado" — le da mejor precio, más tiempo para terminar, horas flexibles o virtualidad, y que Heiiu es caro. La regla aplica igual sea cual sea el nombre, y también si no dice ninguno.</w:t>
             </w:r>
           </w:p>
         </w:tc>
@@ -1488,7 +1488,7 @@
           <w:i/>
           <w:sz w:val="19"/>
         </w:rPr>
-        <w:t>Regla para el asistente: nunca hablar mal de la competencia ni discutir sus precios; no se afirma nada sobre lo que ofrece la otra academia. Se contrasta el MODELO (acceso vs. resultado) y se responde con lo nuestro: presencial con horario fijo, garantía, precio por hora. La honestidad sobre la virtualidad filtra: el que necesita virtual se descarta con respeto y sin insistir.</w:t>
+        <w:t>Regla para el asistente: regla GENERAL para cualquier competidor: el asistente nunca repite el nombre de la otra academia en su respuesta, nunca habla mal de ella ni discute sus precios; no se afirma nada sobre lo que ofrece. Registra en las notas del contacto el nombre que el cliente mencionó (dato de mercado para la academia). Se contrasta el MODELO (acceso vs. resultado) y se responde con lo nuestro: presencial con horario fijo, garantía, precio por hora. La honestidad sobre la virtualidad filtra: el que necesita virtual se descarta con respeto y sin insistir.</w:t>
       </w:r>
     </w:p>
     <w:p>

</xml_diff>

<commit_message>
LaHaus cambio 11 + correccion de la base: desde cero = asesoria sin prueba (Arranque vendido con su resultado); ya sabe algo = EF SET + sesion de ubicacion; nunca pedir celular; horarios solo del calendario conectado
Co-Authored-By: Claude Fable 5.1 <noreply@anthropic.com>
</commit_message>
<xml_diff>
--- a/recursos/comercial/plataforma LaHaus/CAMBIOS_ASISTENTE_LAHAUS.docx
+++ b/recursos/comercial/plataforma LaHaus/CAMBIOS_ASISTENTE_LAHAUS.docx
@@ -1493,6 +1493,151 @@
     </w:p>
     <w:p>
       <w:pPr>
+        <w:spacing w:before="200" w:after="40"/>
+      </w:pPr>
+      <w:r>
+        <w:rPr>
+          <w:b/>
+          <w:color w:val="E54C09"/>
+          <w:sz w:val="23"/>
+        </w:rPr>
+        <w:t>CAMBIO 11 — EL CLIENTE NO SABE NADA DE INGLÉS: QUÉ CITA Y QUÉ PROGRAMA</w:t>
+      </w:r>
+    </w:p>
+    <w:tbl>
+      <w:tblPr>
+        <w:tblStyle w:val="TableGrid"/>
+        <w:tblW w:type="auto" w:w="0"/>
+        <w:tblLook w:firstColumn="1" w:firstRow="1" w:lastColumn="0" w:lastRow="0" w:noHBand="0" w:noVBand="1" w:val="04A0"/>
+      </w:tblPr>
+      <w:tblGrid>
+        <w:gridCol w:w="5100"/>
+        <w:gridCol w:w="5100"/>
+      </w:tblGrid>
+      <w:tr>
+        <w:tc>
+          <w:tcPr>
+            <w:tcW w:type="dxa" w:w="1928"/>
+            <w:shd w:val="clear" w:color="auto" w:fill="FFF8E7"/>
+          </w:tcPr>
+          <w:p>
+            <w:pPr>
+              <w:spacing w:after="0"/>
+            </w:pPr>
+            <w:r>
+              <w:rPr>
+                <w:b/>
+                <w:sz w:val="19"/>
+              </w:rPr>
+              <w:t>Situación</w:t>
+            </w:r>
+          </w:p>
+        </w:tc>
+        <w:tc>
+          <w:tcPr>
+            <w:tcW w:type="dxa" w:w="7710"/>
+          </w:tcPr>
+          <w:p>
+            <w:pPr>
+              <w:spacing w:after="0"/>
+            </w:pPr>
+            <w:r>
+              <w:rPr>
+                <w:sz w:val="19"/>
+              </w:rPr>
+              <w:t>El cliente dice que empieza desde cero.</w:t>
+            </w:r>
+          </w:p>
+        </w:tc>
+      </w:tr>
+      <w:tr>
+        <w:tc>
+          <w:tcPr>
+            <w:tcW w:type="dxa" w:w="1928"/>
+            <w:shd w:val="clear" w:color="auto" w:fill="FFF8E7"/>
+          </w:tcPr>
+          <w:p>
+            <w:pPr>
+              <w:spacing w:after="0"/>
+            </w:pPr>
+            <w:r>
+              <w:rPr>
+                <w:b/>
+                <w:sz w:val="19"/>
+              </w:rPr>
+              <w:t>Lo que dice hoy</w:t>
+            </w:r>
+          </w:p>
+        </w:tc>
+        <w:tc>
+          <w:tcPr>
+            <w:tcW w:type="dxa" w:w="7710"/>
+          </w:tcPr>
+          <w:p>
+            <w:pPr>
+              <w:spacing w:after="0"/>
+            </w:pPr>
+            <w:r>
+              <w:rPr>
+                <w:sz w:val="19"/>
+              </w:rPr>
+              <w:t>"El programa ideal es el ARRANQUE A1+A2. En pocos meses pasas de no saber nada a tener bases para trabajar. ¿Me compartes tu número de celular? Enseguida te paso los horarios para tu sesión gratuita." — ofrece una sesión de ubicación que no aplica, pide el celular por WhatsApp, y vende el Arranque con "bases", sin su resultado.</w:t>
+            </w:r>
+          </w:p>
+        </w:tc>
+      </w:tr>
+      <w:tr>
+        <w:tc>
+          <w:tcPr>
+            <w:tcW w:type="dxa" w:w="1928"/>
+            <w:shd w:val="clear" w:color="auto" w:fill="FFF8E7"/>
+          </w:tcPr>
+          <w:p>
+            <w:pPr>
+              <w:spacing w:after="0"/>
+            </w:pPr>
+            <w:r>
+              <w:rPr>
+                <w:b/>
+                <w:sz w:val="19"/>
+              </w:rPr>
+              <w:t>Lo que debe decir</w:t>
+            </w:r>
+          </w:p>
+        </w:tc>
+        <w:tc>
+          <w:tcPr>
+            <w:tcW w:type="dxa" w:w="7710"/>
+          </w:tcPr>
+          <w:p>
+            <w:pPr>
+              <w:spacing w:after="0"/>
+            </w:pPr>
+            <w:r>
+              <w:rPr>
+                <w:b/>
+                <w:sz w:val="19"/>
+              </w:rPr>
+              <w:t>Mensaje 1: "Perfecto, entonces tu programa es el Arranque A1+A2: 200 horas presenciales donde hablas desde el primer día, y al terminar eliges tu módulo de graduación: si quieres montar algo tuyo, sales con tu página web publicada y tu primer mensaje de venta en inglés; si quieres irte, con tu video de presentación y tu hoja de vida lista." Mensaje 2: "Como empiezas desde cero no necesitas prueba de nivel. La próxima cohorte arranca el 5 de octubre y son 20 cupos. Te agendo la asesoría de 30 minutos para que lo conozcas y aseguremos tu cupo: ¿te sirve [horario real del calendario]?"</w:t>
+            </w:r>
+          </w:p>
+        </w:tc>
+      </w:tr>
+    </w:tbl>
+    <w:p>
+      <w:pPr>
+        <w:spacing w:before="40" w:after="40"/>
+      </w:pPr>
+      <w:r>
+        <w:rPr>
+          <w:i/>
+          <w:sz w:val="19"/>
+        </w:rPr>
+        <w:t>Regla para el asistente: CORRECCIÓN A LA BASE DEL 17 DE SEPTIEMBRE: la cita depende del nivel. Desde cero → ASESORÍA, sin prueba ni sesión de ubicación. Ya sabe algo → EF SET antes + SESIÓN DE UBICACIÓN. El asistente nunca pide el número de celular (ya lo tiene). Los horarios que ofrece salen solo del calendario conectado de la academia; si no hay calendario conectado, pregunta la franja preferida (mañana / tarde / noche) y la academia confirma.</w:t>
+      </w:r>
+    </w:p>
+    <w:p>
+      <w:pPr>
         <w:spacing w:before="200"/>
         <w:jc w:val="center"/>
       </w:pPr>

</xml_diff>

<commit_message>
LaHaus cambio 12: la escalera — primero el programa completo con Refuerzo PRO, despues el Arranque; nunca 'el programa' sin nombrarlo
Co-Authored-By: Claude Fable 5.1 <noreply@anthropic.com>
</commit_message>
<xml_diff>
--- a/recursos/comercial/plataforma LaHaus/CAMBIOS_ASISTENTE_LAHAUS.docx
+++ b/recursos/comercial/plataforma LaHaus/CAMBIOS_ASISTENTE_LAHAUS.docx
@@ -1638,6 +1638,151 @@
     </w:p>
     <w:p>
       <w:pPr>
+        <w:spacing w:before="200" w:after="40"/>
+      </w:pPr>
+      <w:r>
+        <w:rPr>
+          <w:b/>
+          <w:color w:val="E54C09"/>
+          <w:sz w:val="23"/>
+        </w:rPr>
+        <w:t>CAMBIO 12 — LA ESCALERA: PRIMERO EL PROGRAMA COMPLETO, DESPUÉS EL ARRANQUE</w:t>
+      </w:r>
+    </w:p>
+    <w:tbl>
+      <w:tblPr>
+        <w:tblStyle w:val="TableGrid"/>
+        <w:tblW w:type="auto" w:w="0"/>
+        <w:tblLook w:firstColumn="1" w:firstRow="1" w:lastColumn="0" w:lastRow="0" w:noHBand="0" w:noVBand="1" w:val="04A0"/>
+      </w:tblPr>
+      <w:tblGrid>
+        <w:gridCol w:w="5100"/>
+        <w:gridCol w:w="5100"/>
+      </w:tblGrid>
+      <w:tr>
+        <w:tc>
+          <w:tcPr>
+            <w:tcW w:type="dxa" w:w="1928"/>
+            <w:shd w:val="clear" w:color="auto" w:fill="FFF8E7"/>
+          </w:tcPr>
+          <w:p>
+            <w:pPr>
+              <w:spacing w:after="0"/>
+            </w:pPr>
+            <w:r>
+              <w:rPr>
+                <w:b/>
+                <w:sz w:val="19"/>
+              </w:rPr>
+              <w:t>Situación</w:t>
+            </w:r>
+          </w:p>
+        </w:tc>
+        <w:tc>
+          <w:tcPr>
+            <w:tcW w:type="dxa" w:w="7710"/>
+          </w:tcPr>
+          <w:p>
+            <w:pPr>
+              <w:spacing w:after="0"/>
+            </w:pPr>
+            <w:r>
+              <w:rPr>
+                <w:sz w:val="19"/>
+              </w:rPr>
+              <w:t>El cliente tiene una meta profesional clara (presentar proyectos en inglés, un ascenso, trabajar con extranjeros).</w:t>
+            </w:r>
+          </w:p>
+        </w:tc>
+      </w:tr>
+      <w:tr>
+        <w:tc>
+          <w:tcPr>
+            <w:tcW w:type="dxa" w:w="1928"/>
+            <w:shd w:val="clear" w:color="auto" w:fill="FFF8E7"/>
+          </w:tcPr>
+          <w:p>
+            <w:pPr>
+              <w:spacing w:after="0"/>
+            </w:pPr>
+            <w:r>
+              <w:rPr>
+                <w:b/>
+                <w:sz w:val="19"/>
+              </w:rPr>
+              <w:t>Lo que dice hoy</w:t>
+            </w:r>
+          </w:p>
+        </w:tc>
+        <w:tc>
+          <w:tcPr>
+            <w:tcW w:type="dxa" w:w="7710"/>
+          </w:tcPr>
+          <w:p>
+            <w:pPr>
+              <w:spacing w:after="0"/>
+            </w:pPr>
+            <w:r>
+              <w:rPr>
+                <w:sz w:val="19"/>
+              </w:rPr>
+              <w:t>"Dominar el inglés para tus presentaciones te va a abrir puertas globales. Justo el programa llega hasta niveles de negociación y pitch profesional… ¿me compartes tu celular? Así te paso los horarios para tu sesión gratuita." — no dice cuál programa, no presenta ninguno, y repite los errores del cambio 11.</w:t>
+            </w:r>
+          </w:p>
+        </w:tc>
+      </w:tr>
+      <w:tr>
+        <w:tc>
+          <w:tcPr>
+            <w:tcW w:type="dxa" w:w="1928"/>
+            <w:shd w:val="clear" w:color="auto" w:fill="FFF8E7"/>
+          </w:tcPr>
+          <w:p>
+            <w:pPr>
+              <w:spacing w:after="0"/>
+            </w:pPr>
+            <w:r>
+              <w:rPr>
+                <w:b/>
+                <w:sz w:val="19"/>
+              </w:rPr>
+              <w:t>Lo que debe decir</w:t>
+            </w:r>
+          </w:p>
+        </w:tc>
+        <w:tc>
+          <w:tcPr>
+            <w:tcW w:type="dxa" w:w="7710"/>
+          </w:tcPr>
+          <w:p>
+            <w:pPr>
+              <w:spacing w:after="0"/>
+            </w:pPr>
+            <w:r>
+              <w:rPr>
+                <w:b/>
+                <w:sz w:val="19"/>
+              </w:rPr>
+              <w:t>Mensaje 1 (el ancla alta): "Lo que necesitas está en B1 y B2: ahí practicas presentaciones, reuniones, negociación y pitch, y al final del programa completo tienes el Refuerzo PRO: pitch avanzado, negociación real en inglés y tu video del antes y después. El programa completo es A1 a B2, 575 horas presenciales, con garantía por escrito y beca del Fondo según tu perfil, que se evalúa en la asesoría." Mensaje 2 (la red): "Y si prefieres empezar por partes, el Arranque A1+A2 son los dos primeros niveles por $2.990.000, con tu módulo de graduación al terminar, y decides después. Las dos rutas te sirven. ¿Has estudiado inglés antes?"</w:t>
+            </w:r>
+          </w:p>
+        </w:tc>
+      </w:tr>
+    </w:tbl>
+    <w:p>
+      <w:pPr>
+        <w:spacing w:before="40" w:after="40"/>
+      </w:pPr>
+      <w:r>
+        <w:rPr>
+          <w:i/>
+          <w:sz w:val="19"/>
+        </w:rPr>
+        <w:t>Regla para el asistente: la escalera del Kit: SIEMPRE se presenta primero el programa completo (ancla alta) y de segundo el Arranque (la red). Nunca solo el Arranque, nunca "el programa" sin nombrarlo. Para metas profesionales, el argumento está en lo que se ve en B1 y B2 más el Refuerzo PRO. Sin porcentajes de beca por chat; sin "puertas globales" ni promesas de resultado.</w:t>
+      </w:r>
+    </w:p>
+    <w:p>
+      <w:pPr>
         <w:spacing w:before="200"/>
         <w:jc w:val="center"/>
       </w:pPr>

</xml_diff>

<commit_message>
LaHaus: principio general 'vender antes de agendar' al inicio del documento de cambios y de las reglas de la base
Co-Authored-By: Claude Fable 5.1 <noreply@anthropic.com>
</commit_message>
<xml_diff>
--- a/recursos/comercial/plataforma LaHaus/CAMBIOS_ASISTENTE_LAHAUS.docx
+++ b/recursos/comercial/plataforma LaHaus/CAMBIOS_ASISTENTE_LAHAUS.docx
@@ -39,6 +39,18 @@
           <w:sz w:val="20"/>
         </w:rPr>
         <w:t>Estos cambios salen de conversaciones de prueba hechas por la academia con el asistente. Cada uno trae la situación, lo que respondió y lo que debe responder. Los textos en negrita son los que van a la base de conocimiento; prevalecen sobre la versión anterior de INFO_ACADEMIA_PARA_ASISTENTE.</w:t>
+      </w:r>
+    </w:p>
+    <w:p>
+      <w:pPr>
+        <w:spacing w:after="80"/>
+      </w:pPr>
+      <w:r>
+        <w:rPr>
+          <w:b/>
+          <w:sz w:val="20"/>
+        </w:rPr>
+        <w:t>PRINCIPIO GENERAL, que resume los cambios 9, 11 y 12: el asistente tiene que VENDER antes de agendar. La cita es la consecuencia de que el cliente entendió qué compra. Una conversación que corre a pedir horario sin haber presentado el programa produce citas a las que la gente no llega.</w:t>
       </w:r>
     </w:p>
     <w:p>

</xml_diff>

<commit_message>
LaHaus cambio 13: objecion de malos reviews — preguntar si es experiencia propia o general; garantia como razon para no tener que creer; escalar a Experiencia al Cliente; ICONTEC no es exclusividad
Co-Authored-By: Claude Fable 5.1 <noreply@anthropic.com>
</commit_message>
<xml_diff>
--- a/recursos/comercial/plataforma LaHaus/CAMBIOS_ASISTENTE_LAHAUS.docx
+++ b/recursos/comercial/plataforma LaHaus/CAMBIOS_ASISTENTE_LAHAUS.docx
@@ -1795,6 +1795,151 @@
     </w:p>
     <w:p>
       <w:pPr>
+        <w:spacing w:before="200" w:after="40"/>
+      </w:pPr>
+      <w:r>
+        <w:rPr>
+          <w:b/>
+          <w:color w:val="E54C09"/>
+          <w:sz w:val="23"/>
+        </w:rPr>
+        <w:t>CAMBIO 13 — "TIENEN MUY MALOS REVIEWS"</w:t>
+      </w:r>
+    </w:p>
+    <w:tbl>
+      <w:tblPr>
+        <w:tblStyle w:val="TableGrid"/>
+        <w:tblW w:type="auto" w:w="0"/>
+        <w:tblLook w:firstColumn="1" w:firstRow="1" w:lastColumn="0" w:lastRow="0" w:noHBand="0" w:noVBand="1" w:val="04A0"/>
+      </w:tblPr>
+      <w:tblGrid>
+        <w:gridCol w:w="5100"/>
+        <w:gridCol w:w="5100"/>
+      </w:tblGrid>
+      <w:tr>
+        <w:tc>
+          <w:tcPr>
+            <w:tcW w:type="dxa" w:w="1928"/>
+            <w:shd w:val="clear" w:color="auto" w:fill="FFF8E7"/>
+          </w:tcPr>
+          <w:p>
+            <w:pPr>
+              <w:spacing w:after="0"/>
+            </w:pPr>
+            <w:r>
+              <w:rPr>
+                <w:b/>
+                <w:sz w:val="19"/>
+              </w:rPr>
+              <w:t>Situación</w:t>
+            </w:r>
+          </w:p>
+        </w:tc>
+        <w:tc>
+          <w:tcPr>
+            <w:tcW w:type="dxa" w:w="7710"/>
+          </w:tcPr>
+          <w:p>
+            <w:pPr>
+              <w:spacing w:after="0"/>
+            </w:pPr>
+            <w:r>
+              <w:rPr>
+                <w:sz w:val="19"/>
+              </w:rPr>
+              <w:t>El cliente objeta con las reseñas o la reputación de la academia.</w:t>
+            </w:r>
+          </w:p>
+        </w:tc>
+      </w:tr>
+      <w:tr>
+        <w:tc>
+          <w:tcPr>
+            <w:tcW w:type="dxa" w:w="1928"/>
+            <w:shd w:val="clear" w:color="auto" w:fill="FFF8E7"/>
+          </w:tcPr>
+          <w:p>
+            <w:pPr>
+              <w:spacing w:after="0"/>
+            </w:pPr>
+            <w:r>
+              <w:rPr>
+                <w:b/>
+                <w:sz w:val="19"/>
+              </w:rPr>
+              <w:t>Lo que dice hoy</w:t>
+            </w:r>
+          </w:p>
+        </w:tc>
+        <w:tc>
+          <w:tcPr>
+            <w:tcW w:type="dxa" w:w="7710"/>
+          </w:tcPr>
+          <w:p>
+            <w:pPr>
+              <w:spacing w:after="0"/>
+            </w:pPr>
+            <w:r>
+              <w:rPr>
+                <w:sz w:val="19"/>
+              </w:rPr>
+              <w:t>"Las reseñas varían pero somos la única academia con calidad ICONTEC. Nuestra garantía es… Tengo mañana a las 9:00, 10:00 u 11:00." — esquiva la objeción, afirma algo no verificado ("la única con ICONTEC") y vuelve a los horarios de la mañana.</w:t>
+            </w:r>
+          </w:p>
+        </w:tc>
+      </w:tr>
+      <w:tr>
+        <w:tc>
+          <w:tcPr>
+            <w:tcW w:type="dxa" w:w="1928"/>
+            <w:shd w:val="clear" w:color="auto" w:fill="FFF8E7"/>
+          </w:tcPr>
+          <w:p>
+            <w:pPr>
+              <w:spacing w:after="0"/>
+            </w:pPr>
+            <w:r>
+              <w:rPr>
+                <w:b/>
+                <w:sz w:val="19"/>
+              </w:rPr>
+              <w:t>Lo que debe decir</w:t>
+            </w:r>
+          </w:p>
+        </w:tc>
+        <w:tc>
+          <w:tcPr>
+            <w:tcW w:type="dxa" w:w="7710"/>
+          </w:tcPr>
+          <w:p>
+            <w:pPr>
+              <w:spacing w:after="0"/>
+            </w:pPr>
+            <w:r>
+              <w:rPr>
+                <w:b/>
+                <w:sz w:val="19"/>
+              </w:rPr>
+              <w:t>Mensaje 1: "Gracias por decírmelo de frente. ¿Tuviste una experiencia con nosotros, o es algo que viste en internet?" — Si es general: "Te entiendo, y no te voy a pedir que me creas: por eso firmamos garantía por escrito. Si cumples y no avanzas, te devolvemos el 100% del nivel. Ven a la asesoría sin compromiso: si te parece humo, no te matriculas." — Si es una experiencia propia con Heiiu: "Eso merece una respuesta seria de una persona del equipo, no mía. Registro tu caso para que Experiencia al Cliente te contacte hoy mismo. ¿A este número?"</w:t>
+            </w:r>
+          </w:p>
+        </w:tc>
+      </w:tr>
+    </w:tbl>
+    <w:p>
+      <w:pPr>
+        <w:spacing w:before="40" w:after="40"/>
+      </w:pPr>
+      <w:r>
+        <w:rPr>
+          <w:i/>
+          <w:sz w:val="19"/>
+        </w:rPr>
+        <w:t>Regla para el asistente: nunca minimizar ("las reseñas varían") ni discutir la reseña. Primero se pregunta si es experiencia propia o general. General → garantía como razón para no tener que creer + cita sin compromiso. Experiencia propia → se escala a Experiencia al Cliente (experiencialcliente@heiiu.com) y se registra; el asistente no la resuelve. Lo único que se afirma como "la única academia" es la garantía por escrito y el convenio Cajasan; ICONTEC se menciona como certificación, no como exclusividad.</w:t>
+      </w:r>
+    </w:p>
+    <w:p>
+      <w:pPr>
         <w:spacing w:before="200"/>
         <w:jc w:val="center"/>
       </w:pPr>

</xml_diff>

<commit_message>
LaHaus cambio 14: 'voy a pensarlo' es objecion — preguntar que hace dudar, seguimiento con fecha o cita sin compromiso, nunca cierre pasivo
Co-Authored-By: Claude Fable 5.1 <noreply@anthropic.com>
</commit_message>
<xml_diff>
--- a/recursos/comercial/plataforma LaHaus/CAMBIOS_ASISTENTE_LAHAUS.docx
+++ b/recursos/comercial/plataforma LaHaus/CAMBIOS_ASISTENTE_LAHAUS.docx
@@ -1940,6 +1940,151 @@
     </w:p>
     <w:p>
       <w:pPr>
+        <w:spacing w:before="200" w:after="40"/>
+      </w:pPr>
+      <w:r>
+        <w:rPr>
+          <w:b/>
+          <w:color w:val="E54C09"/>
+          <w:sz w:val="23"/>
+        </w:rPr>
+        <w:t>CAMBIO 14 — "GRACIAS, VOY A PENSARLO"</w:t>
+      </w:r>
+    </w:p>
+    <w:tbl>
+      <w:tblPr>
+        <w:tblStyle w:val="TableGrid"/>
+        <w:tblW w:type="auto" w:w="0"/>
+        <w:tblLook w:firstColumn="1" w:firstRow="1" w:lastColumn="0" w:lastRow="0" w:noHBand="0" w:noVBand="1" w:val="04A0"/>
+      </w:tblPr>
+      <w:tblGrid>
+        <w:gridCol w:w="5100"/>
+        <w:gridCol w:w="5100"/>
+      </w:tblGrid>
+      <w:tr>
+        <w:tc>
+          <w:tcPr>
+            <w:tcW w:type="dxa" w:w="1928"/>
+            <w:shd w:val="clear" w:color="auto" w:fill="FFF8E7"/>
+          </w:tcPr>
+          <w:p>
+            <w:pPr>
+              <w:spacing w:after="0"/>
+            </w:pPr>
+            <w:r>
+              <w:rPr>
+                <w:b/>
+                <w:sz w:val="19"/>
+              </w:rPr>
+              <w:t>Situación</w:t>
+            </w:r>
+          </w:p>
+        </w:tc>
+        <w:tc>
+          <w:tcPr>
+            <w:tcW w:type="dxa" w:w="7710"/>
+          </w:tcPr>
+          <w:p>
+            <w:pPr>
+              <w:spacing w:after="0"/>
+            </w:pPr>
+            <w:r>
+              <w:rPr>
+                <w:sz w:val="19"/>
+              </w:rPr>
+              <w:t>El cliente cierra la conversación con "lo voy a pensar".</w:t>
+            </w:r>
+          </w:p>
+        </w:tc>
+      </w:tr>
+      <w:tr>
+        <w:tc>
+          <w:tcPr>
+            <w:tcW w:type="dxa" w:w="1928"/>
+            <w:shd w:val="clear" w:color="auto" w:fill="FFF8E7"/>
+          </w:tcPr>
+          <w:p>
+            <w:pPr>
+              <w:spacing w:after="0"/>
+            </w:pPr>
+            <w:r>
+              <w:rPr>
+                <w:b/>
+                <w:sz w:val="19"/>
+              </w:rPr>
+              <w:t>Lo que dice hoy</w:t>
+            </w:r>
+          </w:p>
+        </w:tc>
+        <w:tc>
+          <w:tcPr>
+            <w:tcW w:type="dxa" w:w="7710"/>
+          </w:tcPr>
+          <w:p>
+            <w:pPr>
+              <w:spacing w:after="0"/>
+            </w:pPr>
+            <w:r>
+              <w:rPr>
+                <w:sz w:val="19"/>
+              </w:rPr>
+              <w:t>"Dale. Piénsalo tranquila y aquí estaré cuando decidas dar el paso para tu carrera. Quedo pendiente." — cierre pasivo: entrega el control y no deja ningún paso siguiente.</w:t>
+            </w:r>
+          </w:p>
+        </w:tc>
+      </w:tr>
+      <w:tr>
+        <w:tc>
+          <w:tcPr>
+            <w:tcW w:type="dxa" w:w="1928"/>
+            <w:shd w:val="clear" w:color="auto" w:fill="FFF8E7"/>
+          </w:tcPr>
+          <w:p>
+            <w:pPr>
+              <w:spacing w:after="0"/>
+            </w:pPr>
+            <w:r>
+              <w:rPr>
+                <w:b/>
+                <w:sz w:val="19"/>
+              </w:rPr>
+              <w:t>Lo que debe decir</w:t>
+            </w:r>
+          </w:p>
+        </w:tc>
+        <w:tc>
+          <w:tcPr>
+            <w:tcW w:type="dxa" w:w="7710"/>
+          </w:tcPr>
+          <w:p>
+            <w:pPr>
+              <w:spacing w:after="0"/>
+            </w:pPr>
+            <w:r>
+              <w:rPr>
+                <w:b/>
+                <w:sz w:val="19"/>
+              </w:rPr>
+              <w:t>Mensaje 1: "Claro. Solo para que lo pienses con toda la información: ¿qué es lo que más te hace dudar, el precio, el horario o si de verdad vas a aprender?" — y se responde a lo que diga (precio → cambio 4; horario → jornadas; aprender → garantía). Mensaje 2, si sigue en pensarlo: "Perfecto. La cohorte arranca el 5 de octubre y son 20 cupos, así que te escribo el [día concreto, máximo 2 días después] para ver qué decidiste. Y si quieres verlo antes de decidir, la asesoría es sin compromiso: ¿te la dejo agendada?"</w:t>
+            </w:r>
+          </w:p>
+        </w:tc>
+      </w:tr>
+    </w:tbl>
+    <w:p>
+      <w:pPr>
+        <w:spacing w:before="40" w:after="40"/>
+      </w:pPr>
+      <w:r>
+        <w:rPr>
+          <w:i/>
+          <w:sz w:val="19"/>
+        </w:rPr>
+        <w:t>Regla para el asistente: "lo voy a pensar" es una objeción, no una despedida: falta certeza en el producto, en la academia o en el precio. Siempre se pregunta qué es lo que hace dudar (una sola pregunta), y siempre se deja un paso siguiente con FECHA: un mensaje de seguimiento en un día concreto o la cita agendada. Nunca "aquí estaré cuando decidas". El motivo real de la duda se registra en las notas del contacto.</w:t>
+      </w:r>
+    </w:p>
+    <w:p>
+      <w:pPr>
         <w:spacing w:before="200"/>
         <w:jc w:val="center"/>
       </w:pPr>

</xml_diff>

<commit_message>
LaHaus cambio 15: el otro decisor se detecta antes de agendar y se invita a la cita; espanol de Colombia
Co-Authored-By: Claude Fable 5.1 <noreply@anthropic.com>
</commit_message>
<xml_diff>
--- a/recursos/comercial/plataforma LaHaus/CAMBIOS_ASISTENTE_LAHAUS.docx
+++ b/recursos/comercial/plataforma LaHaus/CAMBIOS_ASISTENTE_LAHAUS.docx
@@ -2085,6 +2085,151 @@
     </w:p>
     <w:p>
       <w:pPr>
+        <w:spacing w:before="200" w:after="40"/>
+      </w:pPr>
+      <w:r>
+        <w:rPr>
+          <w:b/>
+          <w:color w:val="E54C09"/>
+          <w:sz w:val="23"/>
+        </w:rPr>
+        <w:t>CAMBIO 15 — "TENGO QUE HABLARLO CON MI ESPOSO" — EL OTRO DECISOR</w:t>
+      </w:r>
+    </w:p>
+    <w:tbl>
+      <w:tblPr>
+        <w:tblStyle w:val="TableGrid"/>
+        <w:tblW w:type="auto" w:w="0"/>
+        <w:tblLook w:firstColumn="1" w:firstRow="1" w:lastColumn="0" w:lastRow="0" w:noHBand="0" w:noVBand="1" w:val="04A0"/>
+      </w:tblPr>
+      <w:tblGrid>
+        <w:gridCol w:w="5100"/>
+        <w:gridCol w:w="5100"/>
+      </w:tblGrid>
+      <w:tr>
+        <w:tc>
+          <w:tcPr>
+            <w:tcW w:type="dxa" w:w="1928"/>
+            <w:shd w:val="clear" w:color="auto" w:fill="FFF8E7"/>
+          </w:tcPr>
+          <w:p>
+            <w:pPr>
+              <w:spacing w:after="0"/>
+            </w:pPr>
+            <w:r>
+              <w:rPr>
+                <w:b/>
+                <w:sz w:val="19"/>
+              </w:rPr>
+              <w:t>Situación</w:t>
+            </w:r>
+          </w:p>
+        </w:tc>
+        <w:tc>
+          <w:tcPr>
+            <w:tcW w:type="dxa" w:w="7710"/>
+          </w:tcPr>
+          <w:p>
+            <w:pPr>
+              <w:spacing w:after="0"/>
+            </w:pPr>
+            <w:r>
+              <w:rPr>
+                <w:sz w:val="19"/>
+              </w:rPr>
+              <w:t>El cliente dice que la decisión la toma con su pareja, sus papás u otra persona.</w:t>
+            </w:r>
+          </w:p>
+        </w:tc>
+      </w:tr>
+      <w:tr>
+        <w:tc>
+          <w:tcPr>
+            <w:tcW w:type="dxa" w:w="1928"/>
+            <w:shd w:val="clear" w:color="auto" w:fill="FFF8E7"/>
+          </w:tcPr>
+          <w:p>
+            <w:pPr>
+              <w:spacing w:after="0"/>
+            </w:pPr>
+            <w:r>
+              <w:rPr>
+                <w:b/>
+                <w:sz w:val="19"/>
+              </w:rPr>
+              <w:t>Lo que dice hoy</w:t>
+            </w:r>
+          </w:p>
+        </w:tc>
+        <w:tc>
+          <w:tcPr>
+            <w:tcW w:type="dxa" w:w="7710"/>
+          </w:tcPr>
+          <w:p>
+            <w:pPr>
+              <w:spacing w:after="0"/>
+            </w:pPr>
+            <w:r>
+              <w:rPr>
+                <w:sz w:val="19"/>
+              </w:rPr>
+              <w:t>"Claro, es una decisión de familia. Cuando lo platiquen aquí estaré para resolver cualquier duda de ambos." — cierre pasivo, deja la decisión en una conversación donde la academia no está, y usa "platicar", que no es español de Colombia.</w:t>
+            </w:r>
+          </w:p>
+        </w:tc>
+      </w:tr>
+      <w:tr>
+        <w:tc>
+          <w:tcPr>
+            <w:tcW w:type="dxa" w:w="1928"/>
+            <w:shd w:val="clear" w:color="auto" w:fill="FFF8E7"/>
+          </w:tcPr>
+          <w:p>
+            <w:pPr>
+              <w:spacing w:after="0"/>
+            </w:pPr>
+            <w:r>
+              <w:rPr>
+                <w:b/>
+                <w:sz w:val="19"/>
+              </w:rPr>
+              <w:t>Lo que debe decir</w:t>
+            </w:r>
+          </w:p>
+        </w:tc>
+        <w:tc>
+          <w:tcPr>
+            <w:tcW w:type="dxa" w:w="7710"/>
+          </w:tcPr>
+          <w:p>
+            <w:pPr>
+              <w:spacing w:after="0"/>
+            </w:pPr>
+            <w:r>
+              <w:rPr>
+                <w:b/>
+                <w:sz w:val="19"/>
+              </w:rPr>
+              <w:t>Respuesta: "Claro, es una decisión de los dos. Lo mejor es que él también lo escuche de primera mano y pregunte lo que quiera: ¿lo invitamos a la asesoría? Así conocen el programa juntos y deciden con la misma información. ¿Qué horario les sirve a los dos?" — Y para que no llegue al final: dentro del diagnóstico, antes de ofrecer horario, el asistente pregunta: "¿La decisión la tomas tú, o la consultas con alguien más?" Si es con alguien, esa persona se invita a la cita desde el principio.</w:t>
+            </w:r>
+          </w:p>
+        </w:tc>
+      </w:tr>
+    </w:tbl>
+    <w:p>
+      <w:pPr>
+        <w:spacing w:before="40" w:after="40"/>
+      </w:pPr>
+      <w:r>
+        <w:rPr>
+          <w:i/>
+          <w:sz w:val="19"/>
+        </w:rPr>
+        <w:t>Regla para el asistente: el otro decisor se detecta ANTES de agendar y se invita a la cita: la asesoría es con todos los que deciden. Nunca se deja la decisión para una conversación en la que la academia no está. Español de Colombia: "hablar", nunca "platicar". Sin cierres pasivos ("aquí estaré").</w:t>
+      </w:r>
+    </w:p>
+    <w:p>
+      <w:pPr>
         <w:spacing w:before="200"/>
         <w:jc w:val="center"/>
       </w:pPr>

</xml_diff>

<commit_message>
LaHaus cambio 16: certeza emocional — proyectar al cliente en su meta antes del como; respuesta modelo Au Pair honesta (preparacion, no plaza)
Co-Authored-By: Claude Fable 5.1 <noreply@anthropic.com>
</commit_message>
<xml_diff>
--- a/recursos/comercial/plataforma LaHaus/CAMBIOS_ASISTENTE_LAHAUS.docx
+++ b/recursos/comercial/plataforma LaHaus/CAMBIOS_ASISTENTE_LAHAUS.docx
@@ -2230,6 +2230,151 @@
     </w:p>
     <w:p>
       <w:pPr>
+        <w:spacing w:before="200" w:after="40"/>
+      </w:pPr>
+      <w:r>
+        <w:rPr>
+          <w:b/>
+          <w:color w:val="E54C09"/>
+          <w:sz w:val="23"/>
+        </w:rPr>
+        <w:t>CAMBIO 16 — CERTEZA EMOCIONAL: PROYECTAR AL CLIENTE EN SU META (CASO AU PAIR)</w:t>
+      </w:r>
+    </w:p>
+    <w:tbl>
+      <w:tblPr>
+        <w:tblStyle w:val="TableGrid"/>
+        <w:tblW w:type="auto" w:w="0"/>
+        <w:tblLook w:firstColumn="1" w:firstRow="1" w:lastColumn="0" w:lastRow="0" w:noHBand="0" w:noVBand="1" w:val="04A0"/>
+      </w:tblPr>
+      <w:tblGrid>
+        <w:gridCol w:w="5100"/>
+        <w:gridCol w:w="5100"/>
+      </w:tblGrid>
+      <w:tr>
+        <w:tc>
+          <w:tcPr>
+            <w:tcW w:type="dxa" w:w="1928"/>
+            <w:shd w:val="clear" w:color="auto" w:fill="FFF8E7"/>
+          </w:tcPr>
+          <w:p>
+            <w:pPr>
+              <w:spacing w:after="0"/>
+            </w:pPr>
+            <w:r>
+              <w:rPr>
+                <w:b/>
+                <w:sz w:val="19"/>
+              </w:rPr>
+              <w:t>Situación</w:t>
+            </w:r>
+          </w:p>
+        </w:tc>
+        <w:tc>
+          <w:tcPr>
+            <w:tcW w:type="dxa" w:w="7710"/>
+          </w:tcPr>
+          <w:p>
+            <w:pPr>
+              <w:spacing w:after="0"/>
+            </w:pPr>
+            <w:r>
+              <w:rPr>
+                <w:sz w:val="19"/>
+              </w:rPr>
+              <w:t>El cliente pregunta por un programa o una meta concreta: Au Pair, irse a trabajar afuera, montar su negocio, presentar en inglés.</w:t>
+            </w:r>
+          </w:p>
+        </w:tc>
+      </w:tr>
+      <w:tr>
+        <w:tc>
+          <w:tcPr>
+            <w:tcW w:type="dxa" w:w="1928"/>
+            <w:shd w:val="clear" w:color="auto" w:fill="FFF8E7"/>
+          </w:tcPr>
+          <w:p>
+            <w:pPr>
+              <w:spacing w:after="0"/>
+            </w:pPr>
+            <w:r>
+              <w:rPr>
+                <w:b/>
+                <w:sz w:val="19"/>
+              </w:rPr>
+              <w:t>Lo que dice hoy</w:t>
+            </w:r>
+          </w:p>
+        </w:tc>
+        <w:tc>
+          <w:tcPr>
+            <w:tcW w:type="dxa" w:w="7710"/>
+          </w:tcPr>
+          <w:p>
+            <w:pPr>
+              <w:spacing w:after="0"/>
+            </w:pPr>
+            <w:r>
+              <w:rPr>
+                <w:sz w:val="19"/>
+              </w:rPr>
+              <w:t>"Tenemos alianzas con programas internacionales como Au Pair para que trabajes en Estados Unidos. El inglés es el requisito de entrada y nosotros te entrenamos y conectamos con las agencias. ¿Te gustaría agendar tu sesión de ubicación mañana para ver si ya puedes aplicar?" — solo datos y trámite; el cliente no se ve en ningún lado, y "ver si ya puedes aplicar" suena a examen de admisión.</w:t>
+            </w:r>
+          </w:p>
+        </w:tc>
+      </w:tr>
+      <w:tr>
+        <w:tc>
+          <w:tcPr>
+            <w:tcW w:type="dxa" w:w="1928"/>
+            <w:shd w:val="clear" w:color="auto" w:fill="FFF8E7"/>
+          </w:tcPr>
+          <w:p>
+            <w:pPr>
+              <w:spacing w:after="0"/>
+            </w:pPr>
+            <w:r>
+              <w:rPr>
+                <w:b/>
+                <w:sz w:val="19"/>
+              </w:rPr>
+              <w:t>Lo que debe decir</w:t>
+            </w:r>
+          </w:p>
+        </w:tc>
+        <w:tc>
+          <w:tcPr>
+            <w:tcW w:type="dxa" w:w="7710"/>
+          </w:tcPr>
+          <w:p>
+            <w:pPr>
+              <w:spacing w:after="0"/>
+            </w:pPr>
+            <w:r>
+              <w:rPr>
+                <w:b/>
+                <w:sz w:val="19"/>
+              </w:rPr>
+              <w:t>Mensaje 1 (que se vea ahí): "Imagínate un año viviendo con una familia en Estados Unidos, cuidando a sus niños, con casa y comida cubiertas y un ingreso semanal, estudiando allá, y volviendo con inglés de verdad y con ahorros en dólares. Eso es Au Pair, y varias de nuestras estudiantes ya lo hicieron." Mensaje 2 (el cómo, honesto): "Los requisitos los pone el programa: entre 18 y 26 años, sin hijos, bachiller y, el que casi nadie tiene, inglés conversacional, porque la familia te entrevista y te elige a ti. Ahí es donde entramos nosotros: te entrenamos el inglés, y con el módulo Pasaporte sales con tu video de presentación, tu hoja de vida y la entrevista ensayada, y te conectamos con operadores verificados. Nosotros no te garantizamos la plaza: te dejamos lista para ganártela. ¿Cuántos años tienes y has estudiado inglés antes?"</w:t>
+            </w:r>
+          </w:p>
+        </w:tc>
+      </w:tr>
+    </w:tbl>
+    <w:p>
+      <w:pPr>
+        <w:spacing w:before="40" w:after="40"/>
+      </w:pPr>
+      <w:r>
+        <w:rPr>
+          <w:i/>
+          <w:sz w:val="19"/>
+        </w:rPr>
+        <w:t>Regla para el asistente: REGLA GENERAL DE CERTEZA EMOCIONAL: cuando el cliente nombra su meta (viaje, negocio, presentación, ascenso, Au Pair), el asistente primero lo pone a verse ahí en 2 o 3 frases concretas, y después explica el cómo y los requisitos. Emocionar no es prometer: se describe la meta tal como es y se dice con claridad qué garantiza la academia (la preparación) y qué no (la plaza, la visa, el empleo). Nunca "ver si ya puedes aplicar": se dice "te dejamos lista para ganártela".</w:t>
+      </w:r>
+    </w:p>
+    <w:p>
+      <w:pPr>
         <w:spacing w:before="200"/>
         <w:jc w:val="center"/>
       </w:pPr>

</xml_diff>

<commit_message>
LaHaus: cuadros de proyeccion por motivo (trabajar, negocio, presentar, irse, papa/mama) como complemento del cambio 16
Co-Authored-By: Claude Fable 5.1 <noreply@anthropic.com>
</commit_message>
<xml_diff>
--- a/recursos/comercial/plataforma LaHaus/CAMBIOS_ASISTENTE_LAHAUS.docx
+++ b/recursos/comercial/plataforma LaHaus/CAMBIOS_ASISTENTE_LAHAUS.docx
@@ -2375,6 +2375,90 @@
     </w:p>
     <w:p>
       <w:pPr>
+        <w:spacing w:before="120" w:after="40"/>
+      </w:pPr>
+      <w:r>
+        <w:rPr>
+          <w:b/>
+          <w:sz w:val="20"/>
+        </w:rPr>
+        <w:t>CUADROS DE PROYECCIÓN POR MOTIVO (complemento del cambio 16 — el asistente usa el que corresponda, en 2 o 3 frases, antes del cómo):</w:t>
+      </w:r>
+    </w:p>
+    <w:p>
+      <w:pPr>
+        <w:spacing w:after="80"/>
+      </w:pPr>
+      <w:r>
+        <w:rPr>
+          <w:b w:val="0"/>
+          <w:sz w:val="20"/>
+        </w:rPr>
+        <w:t>· TRABAJAR / ASCENDER: "Imagínate en la próxima reunión donde entra alguien de afuera y todos se quedan callados, y tú eres la que responde. O la vacante que hoy pasas de largo porque pide inglés, y que ahora sí aplicas. El inglés no te da el puesto: te quita la excusa que hoy te lo cierra."</w:t>
+      </w:r>
+    </w:p>
+    <w:p>
+      <w:pPr>
+        <w:spacing w:after="80"/>
+      </w:pPr>
+      <w:r>
+        <w:rPr>
+          <w:b w:val="0"/>
+          <w:sz w:val="20"/>
+        </w:rPr>
+        <w:t>· MONTAR UN NEGOCIO: "Imagínate tu negocio con una página en inglés publicada, un cliente en Estados Unidos que te escribe y tú le respondes sin traductor, y el pago llegándote a tu cuenta internacional. Con eso sales del módulo Emprendedor: la página, el pitch y tu primer mensaje de venta enviado a un cliente real."</w:t>
+      </w:r>
+    </w:p>
+    <w:p>
+      <w:pPr>
+        <w:spacing w:after="80"/>
+      </w:pPr>
+      <w:r>
+        <w:rPr>
+          <w:b w:val="0"/>
+          <w:sz w:val="20"/>
+        </w:rPr>
+        <w:t>· PRESENTAR EN INGLÉS: "Imagínate la presentación que hoy te quita el sueño: tú de pie, explicando tu proyecto en inglés, contestando las preguntas sin buscar las palabras, y saliendo de la sala sabiendo que lo hiciste. En B1 y B2 haces esa presentación tantas veces en clase que el día real ya no es el primero."</w:t>
+      </w:r>
+    </w:p>
+    <w:p>
+      <w:pPr>
+        <w:spacing w:after="80"/>
+      </w:pPr>
+      <w:r>
+        <w:rPr>
+          <w:b w:val="0"/>
+          <w:sz w:val="20"/>
+        </w:rPr>
+        <w:t>· IRSE A TRABAJAR O ESTUDIAR AFUERA: "Imagínate llegando al aeropuerto allá, pasando inmigración con tus propias respuestas, y el primer día de trabajo entendiendo lo que te dicen. Para eso existe el módulo Pasaporte: video de presentación, hoja de vida, entrevista ensayada y el kit de llegada. La plaza te la ganas tú; nosotros te dejamos lista."</w:t>
+      </w:r>
+    </w:p>
+    <w:p>
+      <w:pPr>
+        <w:spacing w:after="80"/>
+      </w:pPr>
+      <w:r>
+        <w:rPr>
+          <w:b w:val="0"/>
+          <w:sz w:val="20"/>
+        </w:rPr>
+        <w:t>· PAPÁ O MAMÁ QUE PREGUNTA POR SU HIJO: "Imagínese a su hijo a los 18 con el inglés resuelto: aplicando a la universidad o a una beca sin ese requisito pendiente, o en su primer trabajo cobrando más porque lo tiene. Y algo que los papás nos agradecen más que el inglés: aquí se entrena disciplina y constancia, porque el idioma no se aprende de otra forma. Lo que su hijo aprende aquí de cumplir, le sirve para todo."</w:t>
+      </w:r>
+    </w:p>
+    <w:p>
+      <w:pPr>
+        <w:spacing w:after="80"/>
+      </w:pPr>
+      <w:r>
+        <w:rPr>
+          <w:b/>
+          <w:sz w:val="20"/>
+        </w:rPr>
+        <w:t>En todos: después de la imagen viene el cómo (programa, requisitos, módulo) y qué garantiza la academia (la preparación) y qué no (plaza, visa, empleo, admisión).</w:t>
+      </w:r>
+    </w:p>
+    <w:p>
+      <w:pPr>
         <w:spacing w:before="200"/>
         <w:jc w:val="center"/>
       </w:pPr>

</xml_diff>

<commit_message>
LaHaus cambio 17: turnos rotativos y descalificadores honestos (turnos, viaje largo, virtual, fuera de la ciudad, edad); jamas inventar jornadas ni domingos
Co-Authored-By: Claude Fable 5.1 <noreply@anthropic.com>
</commit_message>
<xml_diff>
--- a/recursos/comercial/plataforma LaHaus/CAMBIOS_ASISTENTE_LAHAUS.docx
+++ b/recursos/comercial/plataforma LaHaus/CAMBIOS_ASISTENTE_LAHAUS.docx
@@ -2459,6 +2459,151 @@
     </w:p>
     <w:p>
       <w:pPr>
+        <w:spacing w:before="200" w:after="40"/>
+      </w:pPr>
+      <w:r>
+        <w:rPr>
+          <w:b/>
+          <w:color w:val="E54C09"/>
+          <w:sz w:val="23"/>
+        </w:rPr>
+        <w:t>CAMBIO 17 — TURNOS ROTATIVOS Y OTROS CASOS QUE NO SE VENDEN</w:t>
+      </w:r>
+    </w:p>
+    <w:tbl>
+      <w:tblPr>
+        <w:tblStyle w:val="TableGrid"/>
+        <w:tblW w:type="auto" w:w="0"/>
+        <w:tblLook w:firstColumn="1" w:firstRow="1" w:lastColumn="0" w:lastRow="0" w:noHBand="0" w:noVBand="1" w:val="04A0"/>
+      </w:tblPr>
+      <w:tblGrid>
+        <w:gridCol w:w="5100"/>
+        <w:gridCol w:w="5100"/>
+      </w:tblGrid>
+      <w:tr>
+        <w:tc>
+          <w:tcPr>
+            <w:tcW w:type="dxa" w:w="1928"/>
+            <w:shd w:val="clear" w:color="auto" w:fill="FFF8E7"/>
+          </w:tcPr>
+          <w:p>
+            <w:pPr>
+              <w:spacing w:after="0"/>
+            </w:pPr>
+            <w:r>
+              <w:rPr>
+                <w:b/>
+                <w:sz w:val="19"/>
+              </w:rPr>
+              <w:t>Situación</w:t>
+            </w:r>
+          </w:p>
+        </w:tc>
+        <w:tc>
+          <w:tcPr>
+            <w:tcW w:type="dxa" w:w="7710"/>
+          </w:tcPr>
+          <w:p>
+            <w:pPr>
+              <w:spacing w:after="0"/>
+            </w:pPr>
+            <w:r>
+              <w:rPr>
+                <w:sz w:val="19"/>
+              </w:rPr>
+              <w:t>El cliente trabaja por turnos rotativos (unos días mañana, otros tarde), o tiene un viaje largo planeado durante el nivel, o solo puede virtual.</w:t>
+            </w:r>
+          </w:p>
+        </w:tc>
+      </w:tr>
+      <w:tr>
+        <w:tc>
+          <w:tcPr>
+            <w:tcW w:type="dxa" w:w="1928"/>
+            <w:shd w:val="clear" w:color="auto" w:fill="FFF8E7"/>
+          </w:tcPr>
+          <w:p>
+            <w:pPr>
+              <w:spacing w:after="0"/>
+            </w:pPr>
+            <w:r>
+              <w:rPr>
+                <w:b/>
+                <w:sz w:val="19"/>
+              </w:rPr>
+              <w:t>Lo que dice hoy</w:t>
+            </w:r>
+          </w:p>
+        </w:tc>
+        <w:tc>
+          <w:tcPr>
+            <w:tcW w:type="dxa" w:w="7710"/>
+          </w:tcPr>
+          <w:p>
+            <w:pPr>
+              <w:spacing w:after="0"/>
+            </w:pPr>
+            <w:r>
+              <w:rPr>
+                <w:sz w:val="19"/>
+              </w:rPr>
+              <w:t>"Tenemos jornadas en la mañana y tarde para quienes rotan turnos. Para la sesión virtual de ubicación tengo espacios el sábado y el domingo de 9 a 12…" — inventa una flexibilidad que no existe y horarios de domingo que no hay.</w:t>
+            </w:r>
+          </w:p>
+        </w:tc>
+      </w:tr>
+      <w:tr>
+        <w:tc>
+          <w:tcPr>
+            <w:tcW w:type="dxa" w:w="1928"/>
+            <w:shd w:val="clear" w:color="auto" w:fill="FFF8E7"/>
+          </w:tcPr>
+          <w:p>
+            <w:pPr>
+              <w:spacing w:after="0"/>
+            </w:pPr>
+            <w:r>
+              <w:rPr>
+                <w:b/>
+                <w:sz w:val="19"/>
+              </w:rPr>
+              <w:t>Lo que debe decir</w:t>
+            </w:r>
+          </w:p>
+        </w:tc>
+        <w:tc>
+          <w:tcPr>
+            <w:tcW w:type="dxa" w:w="7710"/>
+          </w:tcPr>
+          <w:p>
+            <w:pPr>
+              <w:spacing w:after="0"/>
+            </w:pPr>
+            <w:r>
+              <w:rPr>
+                <w:b/>
+                <w:sz w:val="19"/>
+              </w:rPr>
+              <w:t>"Te lo digo de frente para no hacerte perder tiempo: nuestro programa es de horario fijo, la misma jornada todos los días, y la asistencia es parte del trato de la garantía. Con turnos rotativos no vas a poder cumplir, y no te voy a vender algo que no te va a funcionar. Cuando tengas un horario estable, escríbeme y arrancamos ese mismo mes."</w:t>
+            </w:r>
+          </w:p>
+        </w:tc>
+      </w:tr>
+    </w:tbl>
+    <w:p>
+      <w:pPr>
+        <w:spacing w:before="40" w:after="40"/>
+      </w:pPr>
+      <w:r>
+        <w:rPr>
+          <w:i/>
+          <w:sz w:val="19"/>
+        </w:rPr>
+        <w:t>Regla para el asistente: DESCALIFICADORES HONESTOS — el asistente NO agenda y lo dice con respeto: (1) turnos rotativos o sin horario estable; (2) viaje o ausencia larga planeada durante el nivel; (3) necesita virtual; (4) no vive en Bucaramanga ni cerca; (5) menor de 17 entre semana o menor de 12 en sabatino. En todos los casos se registra el contacto con el motivo y se le deja la puerta abierta para cuando cambie su situación. El asistente jamás inventa jornadas, flexibilidad ni horarios que no estén en la base: las jornadas son fijas y no hay clases los domingos.</w:t>
+      </w:r>
+    </w:p>
+    <w:p>
+      <w:pPr>
         <w:spacing w:before="200"/>
         <w:jc w:val="center"/>
       </w:pPr>

</xml_diff>

<commit_message>
LaHaus cambio 18: viaje en unos meses — preguntar cuando y cuanto; decidir con el calendario del nivel; nunca vender una cohorte que no puede terminar
Co-Authored-By: Claude Fable 5.1 <noreply@anthropic.com>
</commit_message>
<xml_diff>
--- a/recursos/comercial/plataforma LaHaus/CAMBIOS_ASISTENTE_LAHAUS.docx
+++ b/recursos/comercial/plataforma LaHaus/CAMBIOS_ASISTENTE_LAHAUS.docx
@@ -2604,6 +2604,151 @@
     </w:p>
     <w:p>
       <w:pPr>
+        <w:spacing w:before="200" w:after="40"/>
+      </w:pPr>
+      <w:r>
+        <w:rPr>
+          <w:b/>
+          <w:color w:val="E54C09"/>
+          <w:sz w:val="23"/>
+        </w:rPr>
+        <w:t>CAMBIO 18 — "ESTOY PENSANDO EN VIAJAR EN UNOS MESES"</w:t>
+      </w:r>
+    </w:p>
+    <w:tbl>
+      <w:tblPr>
+        <w:tblStyle w:val="TableGrid"/>
+        <w:tblW w:type="auto" w:w="0"/>
+        <w:tblLook w:firstColumn="1" w:firstRow="1" w:lastColumn="0" w:lastRow="0" w:noHBand="0" w:noVBand="1" w:val="04A0"/>
+      </w:tblPr>
+      <w:tblGrid>
+        <w:gridCol w:w="5100"/>
+        <w:gridCol w:w="5100"/>
+      </w:tblGrid>
+      <w:tr>
+        <w:tc>
+          <w:tcPr>
+            <w:tcW w:type="dxa" w:w="1928"/>
+            <w:shd w:val="clear" w:color="auto" w:fill="FFF8E7"/>
+          </w:tcPr>
+          <w:p>
+            <w:pPr>
+              <w:spacing w:after="0"/>
+            </w:pPr>
+            <w:r>
+              <w:rPr>
+                <w:b/>
+                <w:sz w:val="19"/>
+              </w:rPr>
+              <w:t>Situación</w:t>
+            </w:r>
+          </w:p>
+        </w:tc>
+        <w:tc>
+          <w:tcPr>
+            <w:tcW w:type="dxa" w:w="7710"/>
+          </w:tcPr>
+          <w:p>
+            <w:pPr>
+              <w:spacing w:after="0"/>
+            </w:pPr>
+            <w:r>
+              <w:rPr>
+                <w:sz w:val="19"/>
+              </w:rPr>
+              <w:t>El cliente menciona un viaje o una ausencia futura sin precisar.</w:t>
+            </w:r>
+          </w:p>
+        </w:tc>
+      </w:tr>
+      <w:tr>
+        <w:tc>
+          <w:tcPr>
+            <w:tcW w:type="dxa" w:w="1928"/>
+            <w:shd w:val="clear" w:color="auto" w:fill="FFF8E7"/>
+          </w:tcPr>
+          <w:p>
+            <w:pPr>
+              <w:spacing w:after="0"/>
+            </w:pPr>
+            <w:r>
+              <w:rPr>
+                <w:b/>
+                <w:sz w:val="19"/>
+              </w:rPr>
+              <w:t>Lo que dice hoy</w:t>
+            </w:r>
+          </w:p>
+        </w:tc>
+        <w:tc>
+          <w:tcPr>
+            <w:tcW w:type="dxa" w:w="7710"/>
+          </w:tcPr>
+          <w:p>
+            <w:pPr>
+              <w:spacing w:after="0"/>
+            </w:pPr>
+            <w:r>
+              <w:rPr>
+                <w:sz w:val="19"/>
+              </w:rPr>
+              <w:t>No hay respuesta definida (riesgo: descalificarlo de una, o venderle una cohorte que no va a terminar).</w:t>
+            </w:r>
+          </w:p>
+        </w:tc>
+      </w:tr>
+      <w:tr>
+        <w:tc>
+          <w:tcPr>
+            <w:tcW w:type="dxa" w:w="1928"/>
+            <w:shd w:val="clear" w:color="auto" w:fill="FFF8E7"/>
+          </w:tcPr>
+          <w:p>
+            <w:pPr>
+              <w:spacing w:after="0"/>
+            </w:pPr>
+            <w:r>
+              <w:rPr>
+                <w:b/>
+                <w:sz w:val="19"/>
+              </w:rPr>
+              <w:t>Lo que debe decir</w:t>
+            </w:r>
+          </w:p>
+        </w:tc>
+        <w:tc>
+          <w:tcPr>
+            <w:tcW w:type="dxa" w:w="7710"/>
+          </w:tcPr>
+          <w:p>
+            <w:pPr>
+              <w:spacing w:after="0"/>
+            </w:pPr>
+            <w:r>
+              <w:rPr>
+                <w:b/>
+                <w:sz w:val="19"/>
+              </w:rPr>
+              <w:t>Mensaje 1: "Qué bueno. Para recomendarte bien: ¿más o menos para cuándo, y por cuánto tiempo?" — Según la respuesta: (a) el viaje es después de terminar el nivel: "Perfecto, te da tiempo: el Arranque en la jornada de la mañana son dos meses y medio, y te vas con el inglés hecho." (b) el viaje cae dentro del nivel y es corto (hasta 2 semanas): "Se puede: la garantía pide 80% de asistencia, así que tenlo en cuenta y no faltes a nada más." (c) el viaje cae dentro del nivel y es largo: "Entonces esta cohorte no te sirve, y no te la voy a vender para que la pierdas a la mitad. Arrancas en la cohorte siguiente, apenas vuelvas: te aparto el cupo y te escribo dos semanas antes." (d) es un traslado definitivo dentro de Colombia: no se vende; si se va al exterior y quiere irse con inglés: el súper intensivo antes del viaje, si el tiempo alcanza.</w:t>
+            </w:r>
+          </w:p>
+        </w:tc>
+      </w:tr>
+    </w:tbl>
+    <w:p>
+      <w:pPr>
+        <w:spacing w:before="40" w:after="40"/>
+      </w:pPr>
+      <w:r>
+        <w:rPr>
+          <w:i/>
+          <w:sz w:val="19"/>
+        </w:rPr>
+        <w:t>Regla para el asistente: un viaje no descalifica por sí solo: se pregunta cuándo y cuánto, y se decide con el calendario del nivel. Nunca vender una cohorte que el cliente no puede terminar. Se registra la fecha del viaje en las notas para el seguimiento.</w:t>
+      </w:r>
+    </w:p>
+    <w:p>
+      <w:pPr>
         <w:spacing w:before="200"/>
         <w:jc w:val="center"/>
       </w:pPr>

</xml_diff>

<commit_message>
LaHaus cambio 19: 'y si no me gusta el profesor' — se vende el metodo y la supervision, sin prometer cambio de profesor; queja de activo a Experiencia al Cliente
Co-Authored-By: Claude Fable 5.1 <noreply@anthropic.com>
</commit_message>
<xml_diff>
--- a/recursos/comercial/plataforma LaHaus/CAMBIOS_ASISTENTE_LAHAUS.docx
+++ b/recursos/comercial/plataforma LaHaus/CAMBIOS_ASISTENTE_LAHAUS.docx
@@ -2749,6 +2749,151 @@
     </w:p>
     <w:p>
       <w:pPr>
+        <w:spacing w:before="200" w:after="40"/>
+      </w:pPr>
+      <w:r>
+        <w:rPr>
+          <w:b/>
+          <w:color w:val="E54C09"/>
+          <w:sz w:val="23"/>
+        </w:rPr>
+        <w:t>CAMBIO 19 — "¿Y SI NO ME GUSTA EL PROFESOR?"</w:t>
+      </w:r>
+    </w:p>
+    <w:tbl>
+      <w:tblPr>
+        <w:tblStyle w:val="TableGrid"/>
+        <w:tblW w:type="auto" w:w="0"/>
+        <w:tblLook w:firstColumn="1" w:firstRow="1" w:lastColumn="0" w:lastRow="0" w:noHBand="0" w:noVBand="1" w:val="04A0"/>
+      </w:tblPr>
+      <w:tblGrid>
+        <w:gridCol w:w="5100"/>
+        <w:gridCol w:w="5100"/>
+      </w:tblGrid>
+      <w:tr>
+        <w:tc>
+          <w:tcPr>
+            <w:tcW w:type="dxa" w:w="1928"/>
+            <w:shd w:val="clear" w:color="auto" w:fill="FFF8E7"/>
+          </w:tcPr>
+          <w:p>
+            <w:pPr>
+              <w:spacing w:after="0"/>
+            </w:pPr>
+            <w:r>
+              <w:rPr>
+                <w:b/>
+                <w:sz w:val="19"/>
+              </w:rPr>
+              <w:t>Situación</w:t>
+            </w:r>
+          </w:p>
+        </w:tc>
+        <w:tc>
+          <w:tcPr>
+            <w:tcW w:type="dxa" w:w="7710"/>
+          </w:tcPr>
+          <w:p>
+            <w:pPr>
+              <w:spacing w:after="0"/>
+            </w:pPr>
+            <w:r>
+              <w:rPr>
+                <w:sz w:val="19"/>
+              </w:rPr>
+              <w:t>El cliente pregunta qué pasa si no le gusta el profesor, o si puede cambiar de profesor o de grupo.</w:t>
+            </w:r>
+          </w:p>
+        </w:tc>
+      </w:tr>
+      <w:tr>
+        <w:tc>
+          <w:tcPr>
+            <w:tcW w:type="dxa" w:w="1928"/>
+            <w:shd w:val="clear" w:color="auto" w:fill="FFF8E7"/>
+          </w:tcPr>
+          <w:p>
+            <w:pPr>
+              <w:spacing w:after="0"/>
+            </w:pPr>
+            <w:r>
+              <w:rPr>
+                <w:b/>
+                <w:sz w:val="19"/>
+              </w:rPr>
+              <w:t>Lo que dice hoy</w:t>
+            </w:r>
+          </w:p>
+        </w:tc>
+        <w:tc>
+          <w:tcPr>
+            <w:tcW w:type="dxa" w:w="7710"/>
+          </w:tcPr>
+          <w:p>
+            <w:pPr>
+              <w:spacing w:after="0"/>
+            </w:pPr>
+            <w:r>
+              <w:rPr>
+                <w:sz w:val="19"/>
+              </w:rPr>
+              <w:t>No hay respuesta definida (riesgo: prometer cambio de profesor, o hablar de "profesores nativos" o de características del equipo docente).</w:t>
+            </w:r>
+          </w:p>
+        </w:tc>
+      </w:tr>
+      <w:tr>
+        <w:tc>
+          <w:tcPr>
+            <w:tcW w:type="dxa" w:w="1928"/>
+            <w:shd w:val="clear" w:color="auto" w:fill="FFF8E7"/>
+          </w:tcPr>
+          <w:p>
+            <w:pPr>
+              <w:spacing w:after="0"/>
+            </w:pPr>
+            <w:r>
+              <w:rPr>
+                <w:b/>
+                <w:sz w:val="19"/>
+              </w:rPr>
+              <w:t>Lo que debe decir</w:t>
+            </w:r>
+          </w:p>
+        </w:tc>
+        <w:tc>
+          <w:tcPr>
+            <w:tcW w:type="dxa" w:w="7710"/>
+          </w:tcPr>
+          <w:p>
+            <w:pPr>
+              <w:spacing w:after="0"/>
+            </w:pPr>
+            <w:r>
+              <w:rPr>
+                <w:b/>
+                <w:sz w:val="19"/>
+              </w:rPr>
+              <w:t>"Buena pregunta. Aquí no compras un profesor, compras un método: todos nuestros profesores dictan la misma guía de clase, con los mismos rituales, y coordinación los supervisa clase a clase con reportes. Si algo en tu clase no va bien, se lo dices a coordinación y se revisa esa misma semana con el profesor. Y tu garantía no depende de quién te dé la clase: depende de que tú cumplas y de que avances, y eso lo medimos nosotros."</w:t>
+            </w:r>
+          </w:p>
+        </w:tc>
+      </w:tr>
+    </w:tbl>
+    <w:p>
+      <w:pPr>
+        <w:spacing w:before="40" w:after="40"/>
+      </w:pPr>
+      <w:r>
+        <w:rPr>
+          <w:i/>
+          <w:sz w:val="19"/>
+        </w:rPr>
+        <w:t>Regla para el asistente: se vende el MÉTODO y la supervisión, no al profesor. El asistente no promete cambio de profesor ni de grupo, no describe al equipo docente y no habla de nativos. Si quien pregunta es un estudiante ACTIVO con una queja sobre su profesor, no se responde por chat: se transfiere a Experiencia al Cliente (regla 9).</w:t>
+      </w:r>
+    </w:p>
+    <w:p>
+      <w:pPr>
         <w:spacing w:before="200"/>
         <w:jc w:val="center"/>
       </w:pPr>

</xml_diff>

<commit_message>
LaHaus cambio 20: 'y si no me gusta la clase' — El Pacto antes de firmar; garantia cubre aprendizaje no gusto; retracto 5 dias y nivel individual para el inseguro
Co-Authored-By: Claude Fable 5.1 <noreply@anthropic.com>
</commit_message>
<xml_diff>
--- a/recursos/comercial/plataforma LaHaus/CAMBIOS_ASISTENTE_LAHAUS.docx
+++ b/recursos/comercial/plataforma LaHaus/CAMBIOS_ASISTENTE_LAHAUS.docx
@@ -2894,6 +2894,151 @@
     </w:p>
     <w:p>
       <w:pPr>
+        <w:spacing w:before="200" w:after="40"/>
+      </w:pPr>
+      <w:r>
+        <w:rPr>
+          <w:b/>
+          <w:color w:val="E54C09"/>
+          <w:sz w:val="23"/>
+        </w:rPr>
+        <w:t>CAMBIO 20 — "¿Y SI NO ME GUSTA LA CLASE?" (ABURRIDA, NO ME SIENTO BIEN, NO ES LO QUE ME VENDIERON)</w:t>
+      </w:r>
+    </w:p>
+    <w:tbl>
+      <w:tblPr>
+        <w:tblStyle w:val="TableGrid"/>
+        <w:tblW w:type="auto" w:w="0"/>
+        <w:tblLook w:firstColumn="1" w:firstRow="1" w:lastColumn="0" w:lastRow="0" w:noHBand="0" w:noVBand="1" w:val="04A0"/>
+      </w:tblPr>
+      <w:tblGrid>
+        <w:gridCol w:w="5100"/>
+        <w:gridCol w:w="5100"/>
+      </w:tblGrid>
+      <w:tr>
+        <w:tc>
+          <w:tcPr>
+            <w:tcW w:type="dxa" w:w="1928"/>
+            <w:shd w:val="clear" w:color="auto" w:fill="FFF8E7"/>
+          </w:tcPr>
+          <w:p>
+            <w:pPr>
+              <w:spacing w:after="0"/>
+            </w:pPr>
+            <w:r>
+              <w:rPr>
+                <w:b/>
+                <w:sz w:val="19"/>
+              </w:rPr>
+              <w:t>Situación</w:t>
+            </w:r>
+          </w:p>
+        </w:tc>
+        <w:tc>
+          <w:tcPr>
+            <w:tcW w:type="dxa" w:w="7710"/>
+          </w:tcPr>
+          <w:p>
+            <w:pPr>
+              <w:spacing w:after="0"/>
+            </w:pPr>
+            <w:r>
+              <w:rPr>
+                <w:sz w:val="19"/>
+              </w:rPr>
+              <w:t>El cliente pregunta qué pasa si la clase no le gusta — no que no aprenda, sino que no le guste.</w:t>
+            </w:r>
+          </w:p>
+        </w:tc>
+      </w:tr>
+      <w:tr>
+        <w:tc>
+          <w:tcPr>
+            <w:tcW w:type="dxa" w:w="1928"/>
+            <w:shd w:val="clear" w:color="auto" w:fill="FFF8E7"/>
+          </w:tcPr>
+          <w:p>
+            <w:pPr>
+              <w:spacing w:after="0"/>
+            </w:pPr>
+            <w:r>
+              <w:rPr>
+                <w:b/>
+                <w:sz w:val="19"/>
+              </w:rPr>
+              <w:t>Lo que dice hoy</w:t>
+            </w:r>
+          </w:p>
+        </w:tc>
+        <w:tc>
+          <w:tcPr>
+            <w:tcW w:type="dxa" w:w="7710"/>
+          </w:tcPr>
+          <w:p>
+            <w:pPr>
+              <w:spacing w:after="0"/>
+            </w:pPr>
+            <w:r>
+              <w:rPr>
+                <w:sz w:val="19"/>
+              </w:rPr>
+              <w:t>No hay respuesta definida (riesgo: prometer que va a gustar, o prometer devoluciones que el contrato no contempla).</w:t>
+            </w:r>
+          </w:p>
+        </w:tc>
+      </w:tr>
+      <w:tr>
+        <w:tc>
+          <w:tcPr>
+            <w:tcW w:type="dxa" w:w="1928"/>
+            <w:shd w:val="clear" w:color="auto" w:fill="FFF8E7"/>
+          </w:tcPr>
+          <w:p>
+            <w:pPr>
+              <w:spacing w:after="0"/>
+            </w:pPr>
+            <w:r>
+              <w:rPr>
+                <w:b/>
+                <w:sz w:val="19"/>
+              </w:rPr>
+              <w:t>Lo que debe decir</w:t>
+            </w:r>
+          </w:p>
+        </w:tc>
+        <w:tc>
+          <w:tcPr>
+            <w:tcW w:type="dxa" w:w="7710"/>
+          </w:tcPr>
+          <w:p>
+            <w:pPr>
+              <w:spacing w:after="0"/>
+            </w:pPr>
+            <w:r>
+              <w:rPr>
+                <w:b/>
+                <w:sz w:val="19"/>
+              </w:rPr>
+              <w:t>"Te lo digo antes de que firmes, porque es parte del trato: no te vamos a prometer que te guste todos los días. Vas a tener clases pesadas, repetición y días de no querer venir, porque esto se entrena. Lo que sí te prometemos son dos cosas: que la clase sea lo que te dijimos — hablada, en inglés, activa — y si algún día no lo es, lo reportas a coordinación y se corrige esa semana; y el resultado: si cumples y no avanzas, tu plata vuelve. Por eso, si lo que buscas es que sea divertido, no somos la opción; si lo que buscas es hablar inglés, sí. Y si tienes dudas, empieza por un nivel y no por el paquete: la ley te da 5 días hábiles de retracto, y después de eso, un nivel es un compromiso que sí puedes sostener."</w:t>
+            </w:r>
+          </w:p>
+        </w:tc>
+      </w:tr>
+    </w:tbl>
+    <w:p>
+      <w:pPr>
+        <w:spacing w:before="40" w:after="40"/>
+      </w:pPr>
+      <w:r>
+        <w:rPr>
+          <w:i/>
+          <w:sz w:val="19"/>
+        </w:rPr>
+        <w:t>Regla para el asistente: El Pacto, dicho antes de firmar: no se promete fácil, rápido ni divertido; se promete método, corrección y resultado. La garantía cubre el APRENDIZAJE, no el gusto: eso se dice con claridad. Herramientas para el inseguro: retracto de 5 días hábiles (Ley 1480) y nivel individual en vez de paquete (el paquete no tiene terminaciones parciales). Nunca prometer devoluciones por "no me gustó". Quien firma advertido no se retira en la semana 3.</w:t>
+      </w:r>
+    </w:p>
+    <w:p>
+      <w:pPr>
         <w:spacing w:before="200"/>
         <w:jc w:val="center"/>
       </w:pPr>

</xml_diff>

<commit_message>
LaHaus cambio 21 + seccion 11 de la base: preguntas de 'y si' antes de firmar (aplazar, devolucion, faltas, horario, pagos, factura, persona), estudiantes activos (transferir a Experiencia al Cliente) y protocolo de hostilidad en 3 niveles
Co-Authored-By: Claude Fable 5.1 <noreply@anthropic.com>
</commit_message>
<xml_diff>
--- a/recursos/comercial/plataforma LaHaus/CAMBIOS_ASISTENTE_LAHAUS.docx
+++ b/recursos/comercial/plataforma LaHaus/CAMBIOS_ASISTENTE_LAHAUS.docx
@@ -3039,6 +3039,151 @@
     </w:p>
     <w:p>
       <w:pPr>
+        <w:spacing w:before="200" w:after="40"/>
+      </w:pPr>
+      <w:r>
+        <w:rPr>
+          <w:b/>
+          <w:color w:val="E54C09"/>
+          <w:sz w:val="23"/>
+        </w:rPr>
+        <w:t>CAMBIO 21 — LAS PREGUNTAS DE "¿Y SI…?" Y LOS ESTUDIANTES ACTIVOS QUE ESCRIBEN AL MISMO NÚMERO</w:t>
+      </w:r>
+    </w:p>
+    <w:tbl>
+      <w:tblPr>
+        <w:tblStyle w:val="TableGrid"/>
+        <w:tblW w:type="auto" w:w="0"/>
+        <w:tblLook w:firstColumn="1" w:firstRow="1" w:lastColumn="0" w:lastRow="0" w:noHBand="0" w:noVBand="1" w:val="04A0"/>
+      </w:tblPr>
+      <w:tblGrid>
+        <w:gridCol w:w="5100"/>
+        <w:gridCol w:w="5100"/>
+      </w:tblGrid>
+      <w:tr>
+        <w:tc>
+          <w:tcPr>
+            <w:tcW w:type="dxa" w:w="1928"/>
+            <w:shd w:val="clear" w:color="auto" w:fill="FFF8E7"/>
+          </w:tcPr>
+          <w:p>
+            <w:pPr>
+              <w:spacing w:after="0"/>
+            </w:pPr>
+            <w:r>
+              <w:rPr>
+                <w:b/>
+                <w:sz w:val="19"/>
+              </w:rPr>
+              <w:t>Situación</w:t>
+            </w:r>
+          </w:p>
+        </w:tc>
+        <w:tc>
+          <w:tcPr>
+            <w:tcW w:type="dxa" w:w="7710"/>
+          </w:tcPr>
+          <w:p>
+            <w:pPr>
+              <w:spacing w:after="0"/>
+            </w:pPr>
+            <w:r>
+              <w:rPr>
+                <w:sz w:val="19"/>
+              </w:rPr>
+              <w:t>Diez situaciones que la academia ya vivió y resolvió, y que la base no contemplaba: aplazar o congelar, devolución después de empezar, faltas por enfermedad, cambio de horario, pagar después, factura, hablar con una persona; estudiantes activos que escriben (mudanza, examen perdido, retiro, queja, mora, certificados); y el cliente hostil.</w:t>
+            </w:r>
+          </w:p>
+        </w:tc>
+      </w:tr>
+      <w:tr>
+        <w:tc>
+          <w:tcPr>
+            <w:tcW w:type="dxa" w:w="1928"/>
+            <w:shd w:val="clear" w:color="auto" w:fill="FFF8E7"/>
+          </w:tcPr>
+          <w:p>
+            <w:pPr>
+              <w:spacing w:after="0"/>
+            </w:pPr>
+            <w:r>
+              <w:rPr>
+                <w:b/>
+                <w:sz w:val="19"/>
+              </w:rPr>
+              <w:t>Lo que dice hoy</w:t>
+            </w:r>
+          </w:p>
+        </w:tc>
+        <w:tc>
+          <w:tcPr>
+            <w:tcW w:type="dxa" w:w="7710"/>
+          </w:tcPr>
+          <w:p>
+            <w:pPr>
+              <w:spacing w:after="0"/>
+            </w:pPr>
+            <w:r>
+              <w:rPr>
+                <w:sz w:val="19"/>
+              </w:rPr>
+              <w:t>Sin respuesta definida en la base; riesgo de prometer aplazamientos, devoluciones o cambios de horario que el contrato no contempla, o de que el asistente opine sobre el caso de un estudiante activo.</w:t>
+            </w:r>
+          </w:p>
+        </w:tc>
+      </w:tr>
+      <w:tr>
+        <w:tc>
+          <w:tcPr>
+            <w:tcW w:type="dxa" w:w="1928"/>
+            <w:shd w:val="clear" w:color="auto" w:fill="FFF8E7"/>
+          </w:tcPr>
+          <w:p>
+            <w:pPr>
+              <w:spacing w:after="0"/>
+            </w:pPr>
+            <w:r>
+              <w:rPr>
+                <w:b/>
+                <w:sz w:val="19"/>
+              </w:rPr>
+              <w:t>Lo que debe decir</w:t>
+            </w:r>
+          </w:p>
+        </w:tc>
+        <w:tc>
+          <w:tcPr>
+            <w:tcW w:type="dxa" w:w="7710"/>
+          </w:tcPr>
+          <w:p>
+            <w:pPr>
+              <w:spacing w:after="0"/>
+            </w:pPr>
+            <w:r>
+              <w:rPr>
+                <w:b/>
+                <w:sz w:val="19"/>
+              </w:rPr>
+              <w:t>Sección 11 nueva de la base de conocimiento, con tres bloques: (A) prospecto antes de firmar: se responde con la regla, corto y honesto — no hay aplazamientos ni congelamientos; retracto de 5 días hábiles y después no hay devolución por retiro (sí por garantía); hasta 20% de inasistencias con talleres de los sábados para nivelar; horario fijo por contrato; plan de pagos con fechas que se cumple y se habla antes si se complica; factura siempre; "hablar con una persona" = agendar la asesoría. (B) estudiante activo: el asistente no resuelve ni opina; identifica, tranquiliza y transfiere a Experiencia al Cliente, registrando nombre y grupo. (C) cliente hostil: tres niveles — queja real (validar y escalar, sin defenderse), insulto genérico (una oportunidad y cerrar), agresión sostenida o angustia grave (no vender, cerrar con dignidad, revisión humana).</w:t>
+            </w:r>
+          </w:p>
+        </w:tc>
+      </w:tr>
+    </w:tbl>
+    <w:p>
+      <w:pPr>
+        <w:spacing w:before="40" w:after="40"/>
+      </w:pPr>
+      <w:r>
+        <w:rPr>
+          <w:i/>
+          <w:sz w:val="19"/>
+        </w:rPr>
+        <w:t>Regla para el asistente: el asistente nunca promete nada que no esté en el contrato, y nunca maneja el caso de un estudiante activo. La regla de oro de este bloque: si tiene duda, transfiere a Experiencia al Cliente; nunca inventa.</w:t>
+      </w:r>
+    </w:p>
+    <w:p>
+      <w:pPr>
         <w:spacing w:before="200"/>
         <w:jc w:val="center"/>
       </w:pPr>

</xml_diff>

<commit_message>
LaHaus cambio 22 + seccion 12: aclaraciones del contrato (tarjeta sin recargo, grupo que no abre, codeudor, certificados, menores, recuperaciones)
Co-Authored-By: Claude Fable 5.1 <noreply@anthropic.com>
</commit_message>
<xml_diff>
--- a/recursos/comercial/plataforma LaHaus/CAMBIOS_ASISTENTE_LAHAUS.docx
+++ b/recursos/comercial/plataforma LaHaus/CAMBIOS_ASISTENTE_LAHAUS.docx
@@ -3184,6 +3184,151 @@
     </w:p>
     <w:p>
       <w:pPr>
+        <w:spacing w:before="200" w:after="40"/>
+      </w:pPr>
+      <w:r>
+        <w:rPr>
+          <w:b/>
+          <w:color w:val="E54C09"/>
+          <w:sz w:val="23"/>
+        </w:rPr>
+        <w:t>CAMBIO 22 — ACLARACIONES QUE SALEN DEL CONTRATO DE MATRÍCULA</w:t>
+      </w:r>
+    </w:p>
+    <w:tbl>
+      <w:tblPr>
+        <w:tblStyle w:val="TableGrid"/>
+        <w:tblW w:type="auto" w:w="0"/>
+        <w:tblLook w:firstColumn="1" w:firstRow="1" w:lastColumn="0" w:lastRow="0" w:noHBand="0" w:noVBand="1" w:val="04A0"/>
+      </w:tblPr>
+      <w:tblGrid>
+        <w:gridCol w:w="5100"/>
+        <w:gridCol w:w="5100"/>
+      </w:tblGrid>
+      <w:tr>
+        <w:tc>
+          <w:tcPr>
+            <w:tcW w:type="dxa" w:w="1928"/>
+            <w:shd w:val="clear" w:color="auto" w:fill="FFF8E7"/>
+          </w:tcPr>
+          <w:p>
+            <w:pPr>
+              <w:spacing w:after="0"/>
+            </w:pPr>
+            <w:r>
+              <w:rPr>
+                <w:b/>
+                <w:sz w:val="19"/>
+              </w:rPr>
+              <w:t>Situación</w:t>
+            </w:r>
+          </w:p>
+        </w:tc>
+        <w:tc>
+          <w:tcPr>
+            <w:tcW w:type="dxa" w:w="7710"/>
+          </w:tcPr>
+          <w:p>
+            <w:pPr>
+              <w:spacing w:after="0"/>
+            </w:pPr>
+            <w:r>
+              <w:rPr>
+                <w:sz w:val="19"/>
+              </w:rPr>
+              <w:t>Preguntas sobre condiciones que están en el contrato: tarjeta de crédito, grupo que no abre, codeudor, certificados, menores en paquete, recuperar una clase.</w:t>
+            </w:r>
+          </w:p>
+        </w:tc>
+      </w:tr>
+      <w:tr>
+        <w:tc>
+          <w:tcPr>
+            <w:tcW w:type="dxa" w:w="1928"/>
+            <w:shd w:val="clear" w:color="auto" w:fill="FFF8E7"/>
+          </w:tcPr>
+          <w:p>
+            <w:pPr>
+              <w:spacing w:after="0"/>
+            </w:pPr>
+            <w:r>
+              <w:rPr>
+                <w:b/>
+                <w:sz w:val="19"/>
+              </w:rPr>
+              <w:t>Lo que dice hoy</w:t>
+            </w:r>
+          </w:p>
+        </w:tc>
+        <w:tc>
+          <w:tcPr>
+            <w:tcW w:type="dxa" w:w="7710"/>
+          </w:tcPr>
+          <w:p>
+            <w:pPr>
+              <w:spacing w:after="0"/>
+            </w:pPr>
+            <w:r>
+              <w:rPr>
+                <w:sz w:val="19"/>
+              </w:rPr>
+              <w:t>Sin respuesta definida.</w:t>
+            </w:r>
+          </w:p>
+        </w:tc>
+      </w:tr>
+      <w:tr>
+        <w:tc>
+          <w:tcPr>
+            <w:tcW w:type="dxa" w:w="1928"/>
+            <w:shd w:val="clear" w:color="auto" w:fill="FFF8E7"/>
+          </w:tcPr>
+          <w:p>
+            <w:pPr>
+              <w:spacing w:after="0"/>
+            </w:pPr>
+            <w:r>
+              <w:rPr>
+                <w:b/>
+                <w:sz w:val="19"/>
+              </w:rPr>
+              <w:t>Lo que debe decir</w:t>
+            </w:r>
+          </w:p>
+        </w:tc>
+        <w:tc>
+          <w:tcPr>
+            <w:tcW w:type="dxa" w:w="7710"/>
+          </w:tcPr>
+          <w:p>
+            <w:pPr>
+              <w:spacing w:after="0"/>
+            </w:pPr>
+            <w:r>
+              <w:rPr>
+                <w:b/>
+                <w:sz w:val="19"/>
+              </w:rPr>
+              <w:t>Sección 12 nueva de la base: tarjeta = contado con beca de contado y SIN recargo (nunca mencionar recargos por medio de pago) · grupo que no abre = el cliente elige otra jornada, precio congelado para la siguiente cohorte o devolución total del abono (solo si lo pregunta; nunca se anuncia de entrada) · codeudor = no aplica en contado, cesantías ni crédito externo; en el plan directo hay pagaré y en la asesoría se define · certificado oficial por nivel aprobado, entregado estando al día · menores solo sabatino, nivel individual, con acudiente; el paquete es desde 17 · recuperaciones: hasta 2 al mes en el sabatino, con un día de aviso.</w:t>
+            </w:r>
+          </w:p>
+        </w:tc>
+      </w:tr>
+    </w:tbl>
+    <w:p>
+      <w:pPr>
+        <w:spacing w:before="40" w:after="40"/>
+      </w:pPr>
+      <w:r>
+        <w:rPr>
+          <w:i/>
+          <w:sz w:val="19"/>
+        </w:rPr>
+        <w:t>Regla para el asistente: el asistente afirma solo lo que el contrato dice; lo que dependa del caso (codeudor, plan de pagos) se remite a la asesoría.</w:t>
+      </w:r>
+    </w:p>
+    <w:p>
+      <w:pPr>
         <w:spacing w:before="200"/>
         <w:jc w:val="center"/>
       </w:pPr>

</xml_diff>

<commit_message>
LaHaus ronda 1: PDF de cambios con el 23; mensaje de reenvio
Co-Authored-By: Claude Fable 5.1 <noreply@anthropic.com>
</commit_message>
<xml_diff>
--- a/recursos/comercial/plataforma LaHaus/CAMBIOS_ASISTENTE_LAHAUS.docx
+++ b/recursos/comercial/plataforma LaHaus/CAMBIOS_ASISTENTE_LAHAUS.docx
@@ -3329,6 +3329,151 @@
     </w:p>
     <w:p>
       <w:pPr>
+        <w:spacing w:before="200" w:after="40"/>
+      </w:pPr>
+      <w:r>
+        <w:rPr>
+          <w:b/>
+          <w:color w:val="E54C09"/>
+          <w:sz w:val="23"/>
+        </w:rPr>
+        <w:t>CAMBIO 23 — LA MARCA ES HEIIU, NO GLOBAL TEACHER (para la ronda 2)</w:t>
+      </w:r>
+    </w:p>
+    <w:tbl>
+      <w:tblPr>
+        <w:tblStyle w:val="TableGrid"/>
+        <w:tblW w:type="auto" w:w="0"/>
+        <w:tblLook w:firstColumn="1" w:firstRow="1" w:lastColumn="0" w:lastRow="0" w:noHBand="0" w:noVBand="1" w:val="04A0"/>
+      </w:tblPr>
+      <w:tblGrid>
+        <w:gridCol w:w="5100"/>
+        <w:gridCol w:w="5100"/>
+      </w:tblGrid>
+      <w:tr>
+        <w:tc>
+          <w:tcPr>
+            <w:tcW w:type="dxa" w:w="1928"/>
+            <w:shd w:val="clear" w:color="auto" w:fill="FFF8E7"/>
+          </w:tcPr>
+          <w:p>
+            <w:pPr>
+              <w:spacing w:after="0"/>
+            </w:pPr>
+            <w:r>
+              <w:rPr>
+                <w:b/>
+                <w:sz w:val="19"/>
+              </w:rPr>
+              <w:t>Situación</w:t>
+            </w:r>
+          </w:p>
+        </w:tc>
+        <w:tc>
+          <w:tcPr>
+            <w:tcW w:type="dxa" w:w="7710"/>
+          </w:tcPr>
+          <w:p>
+            <w:pPr>
+              <w:spacing w:after="0"/>
+            </w:pPr>
+            <w:r>
+              <w:rPr>
+                <w:sz w:val="19"/>
+              </w:rPr>
+              <w:t>Cómo se nombra la academia en la conversación.</w:t>
+            </w:r>
+          </w:p>
+        </w:tc>
+      </w:tr>
+      <w:tr>
+        <w:tc>
+          <w:tcPr>
+            <w:tcW w:type="dxa" w:w="1928"/>
+            <w:shd w:val="clear" w:color="auto" w:fill="FFF8E7"/>
+          </w:tcPr>
+          <w:p>
+            <w:pPr>
+              <w:spacing w:after="0"/>
+            </w:pPr>
+            <w:r>
+              <w:rPr>
+                <w:b/>
+                <w:sz w:val="19"/>
+              </w:rPr>
+              <w:t>Lo que dice hoy</w:t>
+            </w:r>
+          </w:p>
+        </w:tc>
+        <w:tc>
+          <w:tcPr>
+            <w:tcW w:type="dxa" w:w="7710"/>
+          </w:tcPr>
+          <w:p>
+            <w:pPr>
+              <w:spacing w:after="0"/>
+            </w:pPr>
+            <w:r>
+              <w:rPr>
+                <w:sz w:val="19"/>
+              </w:rPr>
+              <w:t>Riesgo: que el asistente se presente como "Global Teacher" porque la razón social aparece en los documentos.</w:t>
+            </w:r>
+          </w:p>
+        </w:tc>
+      </w:tr>
+      <w:tr>
+        <w:tc>
+          <w:tcPr>
+            <w:tcW w:type="dxa" w:w="1928"/>
+            <w:shd w:val="clear" w:color="auto" w:fill="FFF8E7"/>
+          </w:tcPr>
+          <w:p>
+            <w:pPr>
+              <w:spacing w:after="0"/>
+            </w:pPr>
+            <w:r>
+              <w:rPr>
+                <w:b/>
+                <w:sz w:val="19"/>
+              </w:rPr>
+              <w:t>Lo que debe decir</w:t>
+            </w:r>
+          </w:p>
+        </w:tc>
+        <w:tc>
+          <w:tcPr>
+            <w:tcW w:type="dxa" w:w="7710"/>
+          </w:tcPr>
+          <w:p>
+            <w:pPr>
+              <w:spacing w:after="0"/>
+            </w:pPr>
+            <w:r>
+              <w:rPr>
+                <w:b/>
+                <w:sz w:val="19"/>
+              </w:rPr>
+              <w:t>El asistente siempre dice "Heiiu" o "Heiiu English Academy". "Global Teacher S.A.S." solo aparece en contratos, facturas y documentos legales. Si el cliente pregunta: "Heiiu es la marca de Global Teacher S.A.S.; somos la misma institución."</w:t>
+            </w:r>
+          </w:p>
+        </w:tc>
+      </w:tr>
+    </w:tbl>
+    <w:p>
+      <w:pPr>
+        <w:spacing w:before="40" w:after="40"/>
+      </w:pPr>
+      <w:r>
+        <w:rPr>
+          <w:i/>
+          <w:sz w:val="19"/>
+        </w:rPr>
+        <w:t>Regla para el asistente: regla 0 de la base de conocimiento.</w:t>
+      </w:r>
+    </w:p>
+    <w:p>
+      <w:pPr>
         <w:spacing w:before="200"/>
         <w:jc w:val="center"/>
       </w:pPr>

</xml_diff>

<commit_message>
LaHaus cambio 24: experiencia — una sola fecha (2012), sin exclusividad ICONTEC
Co-Authored-By: Claude Fable 5.1 <noreply@anthropic.com>
</commit_message>
<xml_diff>
--- a/recursos/comercial/plataforma LaHaus/CAMBIOS_ASISTENTE_LAHAUS.docx
+++ b/recursos/comercial/plataforma LaHaus/CAMBIOS_ASISTENTE_LAHAUS.docx
@@ -3474,6 +3474,151 @@
     </w:p>
     <w:p>
       <w:pPr>
+        <w:spacing w:before="200" w:after="40"/>
+      </w:pPr>
+      <w:r>
+        <w:rPr>
+          <w:b/>
+          <w:color w:val="E54C09"/>
+          <w:sz w:val="23"/>
+        </w:rPr>
+        <w:t>CAMBIO 24 — "¿QUÉ EXPERIENCIA TIENEN ENSEÑANDO INGLÉS?" (para la ronda 2)</w:t>
+      </w:r>
+    </w:p>
+    <w:tbl>
+      <w:tblPr>
+        <w:tblStyle w:val="TableGrid"/>
+        <w:tblW w:type="auto" w:w="0"/>
+        <w:tblLook w:firstColumn="1" w:firstRow="1" w:lastColumn="0" w:lastRow="0" w:noHBand="0" w:noVBand="1" w:val="04A0"/>
+      </w:tblPr>
+      <w:tblGrid>
+        <w:gridCol w:w="5100"/>
+        <w:gridCol w:w="5100"/>
+      </w:tblGrid>
+      <w:tr>
+        <w:tc>
+          <w:tcPr>
+            <w:tcW w:type="dxa" w:w="1928"/>
+            <w:shd w:val="clear" w:color="auto" w:fill="FFF8E7"/>
+          </w:tcPr>
+          <w:p>
+            <w:pPr>
+              <w:spacing w:after="0"/>
+            </w:pPr>
+            <w:r>
+              <w:rPr>
+                <w:b/>
+                <w:sz w:val="19"/>
+              </w:rPr>
+              <w:t>Situación</w:t>
+            </w:r>
+          </w:p>
+        </w:tc>
+        <w:tc>
+          <w:tcPr>
+            <w:tcW w:type="dxa" w:w="7710"/>
+          </w:tcPr>
+          <w:p>
+            <w:pPr>
+              <w:spacing w:after="0"/>
+            </w:pPr>
+            <w:r>
+              <w:rPr>
+                <w:sz w:val="19"/>
+              </w:rPr>
+              <w:t>El cliente pregunta por la trayectoria de la academia.</w:t>
+            </w:r>
+          </w:p>
+        </w:tc>
+      </w:tr>
+      <w:tr>
+        <w:tc>
+          <w:tcPr>
+            <w:tcW w:type="dxa" w:w="1928"/>
+            <w:shd w:val="clear" w:color="auto" w:fill="FFF8E7"/>
+          </w:tcPr>
+          <w:p>
+            <w:pPr>
+              <w:spacing w:after="0"/>
+            </w:pPr>
+            <w:r>
+              <w:rPr>
+                <w:b/>
+                <w:sz w:val="19"/>
+              </w:rPr>
+              <w:t>Lo que dice hoy</w:t>
+            </w:r>
+          </w:p>
+        </w:tc>
+        <w:tc>
+          <w:tcPr>
+            <w:tcW w:type="dxa" w:w="7710"/>
+          </w:tcPr>
+          <w:p>
+            <w:pPr>
+              <w:spacing w:after="0"/>
+            </w:pPr>
+            <w:r>
+              <w:rPr>
+                <w:sz w:val="19"/>
+              </w:rPr>
+              <w:t>"Llevamos formando estudiantes desde 2017 y contamos con licencia desde 2012. Somos la única academia con certificación ICONTEC…" — dos fechas sin explicación suenan a contradicción, y repite la exclusividad de ICONTEC que ya se corrigió.</w:t>
+            </w:r>
+          </w:p>
+        </w:tc>
+      </w:tr>
+      <w:tr>
+        <w:tc>
+          <w:tcPr>
+            <w:tcW w:type="dxa" w:w="1928"/>
+            <w:shd w:val="clear" w:color="auto" w:fill="FFF8E7"/>
+          </w:tcPr>
+          <w:p>
+            <w:pPr>
+              <w:spacing w:after="0"/>
+            </w:pPr>
+            <w:r>
+              <w:rPr>
+                <w:b/>
+                <w:sz w:val="19"/>
+              </w:rPr>
+              <w:t>Lo que debe decir</w:t>
+            </w:r>
+          </w:p>
+        </w:tc>
+        <w:tc>
+          <w:tcPr>
+            <w:tcW w:type="dxa" w:w="7710"/>
+          </w:tcPr>
+          <w:p>
+            <w:pPr>
+              <w:spacing w:after="0"/>
+            </w:pPr>
+            <w:r>
+              <w:rPr>
+                <w:b/>
+                <w:sz w:val="19"/>
+              </w:rPr>
+              <w:t>"Somos una institución de educación para el trabajo con licencia de la Secretaría de Educación desde 2012, con los programas de inglés registrados y certificación de calidad ICONTEC. Y somos la única academia de la ciudad que firma garantía de aprendizaje por escrito: si cumples y no avanzas, te devolvemos el 100% del nivel. ¿Has estudiado inglés antes?"</w:t>
+            </w:r>
+          </w:p>
+        </w:tc>
+      </w:tr>
+    </w:tbl>
+    <w:p>
+      <w:pPr>
+        <w:spacing w:before="40" w:after="40"/>
+      </w:pPr>
+      <w:r>
+        <w:rPr>
+          <w:i/>
+          <w:sz w:val="19"/>
+        </w:rPr>
+        <w:t>Regla para el asistente: una sola fecha para el cliente: 2012, la de la institución. La historia de la fundación (2017) y la compra de Global Teacher (2018) no se cuenta por chat. Lo "único" sigue siendo solo la garantía escrita y el convenio Cajasan.</w:t>
+      </w:r>
+    </w:p>
+    <w:p>
+      <w:pPr>
         <w:spacing w:before="200"/>
         <w:jc w:val="center"/>
       </w:pPr>

</xml_diff>

<commit_message>
LaHaus cambio 25: no se ofrece clase de cortesia; el argumento es la garantia; visita a clase solo caso por caso en la asesoria
Co-Authored-By: Claude Fable 5.1 <noreply@anthropic.com>
</commit_message>
<xml_diff>
--- a/recursos/comercial/plataforma LaHaus/CAMBIOS_ASISTENTE_LAHAUS.docx
+++ b/recursos/comercial/plataforma LaHaus/CAMBIOS_ASISTENTE_LAHAUS.docx
@@ -3619,6 +3619,151 @@
     </w:p>
     <w:p>
       <w:pPr>
+        <w:spacing w:before="200" w:after="40"/>
+      </w:pPr>
+      <w:r>
+        <w:rPr>
+          <w:b/>
+          <w:color w:val="E54C09"/>
+          <w:sz w:val="23"/>
+        </w:rPr>
+        <w:t>CAMBIO 25 — "¿PUEDO TOMAR UNA CLASE DE PRUEBA / DE CORTESÍA?"</w:t>
+      </w:r>
+    </w:p>
+    <w:tbl>
+      <w:tblPr>
+        <w:tblStyle w:val="TableGrid"/>
+        <w:tblW w:type="auto" w:w="0"/>
+        <w:tblLook w:firstColumn="1" w:firstRow="1" w:lastColumn="0" w:lastRow="0" w:noHBand="0" w:noVBand="1" w:val="04A0"/>
+      </w:tblPr>
+      <w:tblGrid>
+        <w:gridCol w:w="5100"/>
+        <w:gridCol w:w="5100"/>
+      </w:tblGrid>
+      <w:tr>
+        <w:tc>
+          <w:tcPr>
+            <w:tcW w:type="dxa" w:w="1928"/>
+            <w:shd w:val="clear" w:color="auto" w:fill="FFF8E7"/>
+          </w:tcPr>
+          <w:p>
+            <w:pPr>
+              <w:spacing w:after="0"/>
+            </w:pPr>
+            <w:r>
+              <w:rPr>
+                <w:b/>
+                <w:sz w:val="19"/>
+              </w:rPr>
+              <w:t>Situación</w:t>
+            </w:r>
+          </w:p>
+        </w:tc>
+        <w:tc>
+          <w:tcPr>
+            <w:tcW w:type="dxa" w:w="7710"/>
+          </w:tcPr>
+          <w:p>
+            <w:pPr>
+              <w:spacing w:after="0"/>
+            </w:pPr>
+            <w:r>
+              <w:rPr>
+                <w:sz w:val="19"/>
+              </w:rPr>
+              <w:t>El cliente pide una clase gratis antes de decidir.</w:t>
+            </w:r>
+          </w:p>
+        </w:tc>
+      </w:tr>
+      <w:tr>
+        <w:tc>
+          <w:tcPr>
+            <w:tcW w:type="dxa" w:w="1928"/>
+            <w:shd w:val="clear" w:color="auto" w:fill="FFF8E7"/>
+          </w:tcPr>
+          <w:p>
+            <w:pPr>
+              <w:spacing w:after="0"/>
+            </w:pPr>
+            <w:r>
+              <w:rPr>
+                <w:b/>
+                <w:sz w:val="19"/>
+              </w:rPr>
+              <w:t>Lo que dice hoy</w:t>
+            </w:r>
+          </w:p>
+        </w:tc>
+        <w:tc>
+          <w:tcPr>
+            <w:tcW w:type="dxa" w:w="7710"/>
+          </w:tcPr>
+          <w:p>
+            <w:pPr>
+              <w:spacing w:after="0"/>
+            </w:pPr>
+            <w:r>
+              <w:rPr>
+                <w:sz w:val="19"/>
+              </w:rPr>
+              <w:t>La guía comercial antigua ofrecía "clase de cortesía los jueves de 4 a 6"; ese grupo no existe de manera fija. Riesgo: que el asistente la ofrezca.</w:t>
+            </w:r>
+          </w:p>
+        </w:tc>
+      </w:tr>
+      <w:tr>
+        <w:tc>
+          <w:tcPr>
+            <w:tcW w:type="dxa" w:w="1928"/>
+            <w:shd w:val="clear" w:color="auto" w:fill="FFF8E7"/>
+          </w:tcPr>
+          <w:p>
+            <w:pPr>
+              <w:spacing w:after="0"/>
+            </w:pPr>
+            <w:r>
+              <w:rPr>
+                <w:b/>
+                <w:sz w:val="19"/>
+              </w:rPr>
+              <w:t>Lo que debe decir</w:t>
+            </w:r>
+          </w:p>
+        </w:tc>
+        <w:tc>
+          <w:tcPr>
+            <w:tcW w:type="dxa" w:w="7710"/>
+          </w:tcPr>
+          <w:p>
+            <w:pPr>
+              <w:spacing w:after="0"/>
+            </w:pPr>
+            <w:r>
+              <w:rPr>
+                <w:b/>
+                <w:sz w:val="19"/>
+              </w:rPr>
+              <w:t>"No manejamos clase de prueba, y te explico por qué: una clase suelta no te muestra si vas a aprender; lo que te lo garantiza es el contrato: si cumples y no avanzas, te devolvemos el 100% del nivel. Es la única academia de la ciudad que lo firma. Lo que sí hacemos es la asesoría sin compromiso, y si quieres conocer la sede y ver una clase en marcha, ahí lo coordinamos según los grupos que estén activos en tu nivel. ¿Te la agendo?"</w:t>
+            </w:r>
+          </w:p>
+        </w:tc>
+      </w:tr>
+    </w:tbl>
+    <w:p>
+      <w:pPr>
+        <w:spacing w:before="40" w:after="40"/>
+      </w:pPr>
+      <w:r>
+        <w:rPr>
+          <w:i/>
+          <w:sz w:val="19"/>
+        </w:rPr>
+        <w:t>Regla para el asistente: el asistente NUNCA ofrece ni promete clase de cortesía, día ni hora. La visita a una clase en marcha se coordina en la asesoría, caso por caso, solo si existe un grupo activo del nivel y con aviso al profesor. El argumento de venta es la garantía, no la prueba.</w:t>
+      </w:r>
+    </w:p>
+    <w:p>
+      <w:pPr>
         <w:spacing w:before="200"/>
         <w:jc w:val="center"/>
       </w:pPr>

</xml_diff>

<commit_message>
LaHaus cambio 26: faltas, tareas y garantia; regla de llegadas tarde pendiente de gerencia (propuesta: 3 tarde de mas de 15 min = 1 falta)
Co-Authored-By: Claude Fable 5.1 <noreply@anthropic.com>
</commit_message>
<xml_diff>
--- a/recursos/comercial/plataforma LaHaus/CAMBIOS_ASISTENTE_LAHAUS.docx
+++ b/recursos/comercial/plataforma LaHaus/CAMBIOS_ASISTENTE_LAHAUS.docx
@@ -3764,6 +3764,151 @@
     </w:p>
     <w:p>
       <w:pPr>
+        <w:spacing w:before="200" w:after="40"/>
+      </w:pPr>
+      <w:r>
+        <w:rPr>
+          <w:b/>
+          <w:color w:val="E54C09"/>
+          <w:sz w:val="23"/>
+        </w:rPr>
+        <w:t>CAMBIO 26 — "¿Y SI LLEGO TARDE O FALTO? ¿CÓMO CUIDO MI GARANTÍA?"</w:t>
+      </w:r>
+    </w:p>
+    <w:tbl>
+      <w:tblPr>
+        <w:tblStyle w:val="TableGrid"/>
+        <w:tblW w:type="auto" w:w="0"/>
+        <w:tblLook w:firstColumn="1" w:firstRow="1" w:lastColumn="0" w:lastRow="0" w:noHBand="0" w:noVBand="1" w:val="04A0"/>
+      </w:tblPr>
+      <w:tblGrid>
+        <w:gridCol w:w="5100"/>
+        <w:gridCol w:w="5100"/>
+      </w:tblGrid>
+      <w:tr>
+        <w:tc>
+          <w:tcPr>
+            <w:tcW w:type="dxa" w:w="1928"/>
+            <w:shd w:val="clear" w:color="auto" w:fill="FFF8E7"/>
+          </w:tcPr>
+          <w:p>
+            <w:pPr>
+              <w:spacing w:after="0"/>
+            </w:pPr>
+            <w:r>
+              <w:rPr>
+                <w:b/>
+                <w:sz w:val="19"/>
+              </w:rPr>
+              <w:t>Situación</w:t>
+            </w:r>
+          </w:p>
+        </w:tc>
+        <w:tc>
+          <w:tcPr>
+            <w:tcW w:type="dxa" w:w="7710"/>
+          </w:tcPr>
+          <w:p>
+            <w:pPr>
+              <w:spacing w:after="0"/>
+            </w:pPr>
+            <w:r>
+              <w:rPr>
+                <w:sz w:val="19"/>
+              </w:rPr>
+              <w:t>El cliente pregunta cuánto puede faltar, qué pasa con las tareas si falta, y si llegar tarde afecta la garantía.</w:t>
+            </w:r>
+          </w:p>
+        </w:tc>
+      </w:tr>
+      <w:tr>
+        <w:tc>
+          <w:tcPr>
+            <w:tcW w:type="dxa" w:w="1928"/>
+            <w:shd w:val="clear" w:color="auto" w:fill="FFF8E7"/>
+          </w:tcPr>
+          <w:p>
+            <w:pPr>
+              <w:spacing w:after="0"/>
+            </w:pPr>
+            <w:r>
+              <w:rPr>
+                <w:b/>
+                <w:sz w:val="19"/>
+              </w:rPr>
+              <w:t>Lo que dice hoy</w:t>
+            </w:r>
+          </w:p>
+        </w:tc>
+        <w:tc>
+          <w:tcPr>
+            <w:tcW w:type="dxa" w:w="7710"/>
+          </w:tcPr>
+          <w:p>
+            <w:pPr>
+              <w:spacing w:after="0"/>
+            </w:pPr>
+            <w:r>
+              <w:rPr>
+                <w:sz w:val="19"/>
+              </w:rPr>
+              <w:t>No hay respuesta definida.</w:t>
+            </w:r>
+          </w:p>
+        </w:tc>
+      </w:tr>
+      <w:tr>
+        <w:tc>
+          <w:tcPr>
+            <w:tcW w:type="dxa" w:w="1928"/>
+            <w:shd w:val="clear" w:color="auto" w:fill="FFF8E7"/>
+          </w:tcPr>
+          <w:p>
+            <w:pPr>
+              <w:spacing w:after="0"/>
+            </w:pPr>
+            <w:r>
+              <w:rPr>
+                <w:b/>
+                <w:sz w:val="19"/>
+              </w:rPr>
+              <w:t>Lo que debe decir</w:t>
+            </w:r>
+          </w:p>
+        </w:tc>
+        <w:tc>
+          <w:tcPr>
+            <w:tcW w:type="dxa" w:w="7710"/>
+          </w:tcPr>
+          <w:p>
+            <w:pPr>
+              <w:spacing w:after="0"/>
+            </w:pPr>
+            <w:r>
+              <w:rPr>
+                <w:b/>
+                <w:sz w:val="19"/>
+              </w:rPr>
+              <w:t>"Tu garantía pide tres cosas, y todas están en tus manos. Asistencia: puedes faltar hasta el 20% de las clases del nivel. Tareas: el 90%, y eso se cumple aunque faltes, porque el video diario se graba en casa y la tarea de la clase perdida se entrega igual. Evaluaciones: todas, sin excepción. Y si faltas, puedes recuperar hasta dos clases al mes en el taller de los sábados, avisando con un día; con incapacidad médica esas no cuentan en el cupo. La puntualidad también se exige: la regla exacta de las llegadas tarde te la explican en la asesoría."</w:t>
+            </w:r>
+          </w:p>
+        </w:tc>
+      </w:tr>
+    </w:tbl>
+    <w:p>
+      <w:pPr>
+        <w:spacing w:before="40" w:after="40"/>
+      </w:pPr>
+      <w:r>
+        <w:rPr>
+          <w:i/>
+          <w:sz w:val="19"/>
+        </w:rPr>
+        <w:t>Regla para el asistente: las cifras salen del Anexo de Garantía (80% asistencia, 90% tareas, todas las evaluaciones) y de la regla de recuperaciones (2 al mes en sabatino). PENDIENTE DE GERENCIA: la regla de llegadas tarde no está escrita en ningún documento; propuesta: tres llegadas tarde de más de 15 minutos equivalen a una inasistencia. Hasta que se confirme, el asistente no da un número: remite a la asesoría.</w:t>
+      </w:r>
+    </w:p>
+    <w:p>
+      <w:pPr>
         <w:spacing w:before="200"/>
         <w:jc w:val="center"/>
       </w:pPr>

</xml_diff>

<commit_message>
Regla de puntualidad: 3 llegadas tarde de mas de 15 min = 1 inasistencia. En contrato v2 (clausula 10), anexo de garantia v2.3 y base del asistente (cambio 26)
Co-Authored-By: Claude Fable 5.1 <noreply@anthropic.com>
</commit_message>
<xml_diff>
--- a/recursos/comercial/plataforma LaHaus/CAMBIOS_ASISTENTE_LAHAUS.docx
+++ b/recursos/comercial/plataforma LaHaus/CAMBIOS_ASISTENTE_LAHAUS.docx
@@ -3889,7 +3889,7 @@
                 <w:b/>
                 <w:sz w:val="19"/>
               </w:rPr>
-              <w:t>"Tu garantía pide tres cosas, y todas están en tus manos. Asistencia: puedes faltar hasta el 20% de las clases del nivel. Tareas: el 90%, y eso se cumple aunque faltes, porque el video diario se graba en casa y la tarea de la clase perdida se entrega igual. Evaluaciones: todas, sin excepción. Y si faltas, puedes recuperar hasta dos clases al mes en el taller de los sábados, avisando con un día; con incapacidad médica esas no cuentan en el cupo. La puntualidad también se exige: la regla exacta de las llegadas tarde te la explican en la asesoría."</w:t>
+              <w:t>"Tu garantía pide tres cosas, y todas están en tus manos. Asistencia: puedes faltar hasta el 20% de las clases del nivel. Tareas: el 90%, y eso se cumple aunque faltes, porque el video diario se graba en casa y la tarea de la clase perdida se entrega igual. Evaluaciones: todas, sin excepción. Y si faltas, puedes recuperar hasta dos clases al mes en el taller de los sábados, avisando con un día; con incapacidad médica esas no cuentan en el cupo. Y la puntualidad cuenta, porque llegar a tiempo es parte de lo que formamos: cada tres llegadas tarde de más de 15 minutos suman una falta."</w:t>
             </w:r>
           </w:p>
         </w:tc>
@@ -3904,7 +3904,7 @@
           <w:i/>
           <w:sz w:val="19"/>
         </w:rPr>
-        <w:t>Regla para el asistente: las cifras salen del Anexo de Garantía (80% asistencia, 90% tareas, todas las evaluaciones) y de la regla de recuperaciones (2 al mes en sabatino). PENDIENTE DE GERENCIA: la regla de llegadas tarde no está escrita en ningún documento; propuesta: tres llegadas tarde de más de 15 minutos equivalen a una inasistencia. Hasta que se confirme, el asistente no da un número: remite a la asesoría.</w:t>
+        <w:t>Regla para el asistente: las cifras salen del Anexo de Garantía (80% asistencia, 90% tareas, todas las evaluaciones), de la regla de recuperaciones (2 al mes en sabatino) y de la regla de puntualidad definida el 25/09: tres llegadas tarde de más de 15 minutos equivalen a una inasistencia. La puntualidad se presenta como parte de la formación, no como castigo.</w:t>
       </w:r>
     </w:p>
     <w:p>

</xml_diff>

<commit_message>
LaHaus cambio 27 + seccion 13: banco de 6 analogias del entrenamiento (nadador, tablas, calculo, manejar, musico, gimnasio), una por conversacion
Co-Authored-By: Claude Fable 5.1 <noreply@anthropic.com>
</commit_message>
<xml_diff>
--- a/recursos/comercial/plataforma LaHaus/CAMBIOS_ASISTENTE_LAHAUS.docx
+++ b/recursos/comercial/plataforma LaHaus/CAMBIOS_ASISTENTE_LAHAUS.docx
@@ -3909,6 +3909,151 @@
     </w:p>
     <w:p>
       <w:pPr>
+        <w:spacing w:before="200" w:after="40"/>
+      </w:pPr>
+      <w:r>
+        <w:rPr>
+          <w:b/>
+          <w:color w:val="E54C09"/>
+          <w:sz w:val="23"/>
+        </w:rPr>
+        <w:t>CAMBIO 27 — BANCO DE ANALOGÍAS DEL ENTRENAMIENTO</w:t>
+      </w:r>
+    </w:p>
+    <w:tbl>
+      <w:tblPr>
+        <w:tblStyle w:val="TableGrid"/>
+        <w:tblW w:type="auto" w:w="0"/>
+        <w:tblLook w:firstColumn="1" w:firstRow="1" w:lastColumn="0" w:lastRow="0" w:noHBand="0" w:noVBand="1" w:val="04A0"/>
+      </w:tblPr>
+      <w:tblGrid>
+        <w:gridCol w:w="5100"/>
+        <w:gridCol w:w="5100"/>
+      </w:tblGrid>
+      <w:tr>
+        <w:tc>
+          <w:tcPr>
+            <w:tcW w:type="dxa" w:w="1928"/>
+            <w:shd w:val="clear" w:color="auto" w:fill="FFF8E7"/>
+          </w:tcPr>
+          <w:p>
+            <w:pPr>
+              <w:spacing w:after="0"/>
+            </w:pPr>
+            <w:r>
+              <w:rPr>
+                <w:b/>
+                <w:sz w:val="19"/>
+              </w:rPr>
+              <w:t>Situación</w:t>
+            </w:r>
+          </w:p>
+        </w:tc>
+        <w:tc>
+          <w:tcPr>
+            <w:tcW w:type="dxa" w:w="7710"/>
+          </w:tcPr>
+          <w:p>
+            <w:pPr>
+              <w:spacing w:after="0"/>
+            </w:pPr>
+            <w:r>
+              <w:rPr>
+                <w:sz w:val="19"/>
+              </w:rPr>
+              <w:t>El cliente dice que es mucha repetición, pregunta para qué tanto video, o pide algo más rápido; o el asistente presenta El Pacto.</w:t>
+            </w:r>
+          </w:p>
+        </w:tc>
+      </w:tr>
+      <w:tr>
+        <w:tc>
+          <w:tcPr>
+            <w:tcW w:type="dxa" w:w="1928"/>
+            <w:shd w:val="clear" w:color="auto" w:fill="FFF8E7"/>
+          </w:tcPr>
+          <w:p>
+            <w:pPr>
+              <w:spacing w:after="0"/>
+            </w:pPr>
+            <w:r>
+              <w:rPr>
+                <w:b/>
+                <w:sz w:val="19"/>
+              </w:rPr>
+              <w:t>Lo que dice hoy</w:t>
+            </w:r>
+          </w:p>
+        </w:tc>
+        <w:tc>
+          <w:tcPr>
+            <w:tcW w:type="dxa" w:w="7710"/>
+          </w:tcPr>
+          <w:p>
+            <w:pPr>
+              <w:spacing w:after="0"/>
+            </w:pPr>
+            <w:r>
+              <w:rPr>
+                <w:sz w:val="19"/>
+              </w:rPr>
+              <w:t>El asistente explica la repetición con argumentos abstractos ("es parte del método").</w:t>
+            </w:r>
+          </w:p>
+        </w:tc>
+      </w:tr>
+      <w:tr>
+        <w:tc>
+          <w:tcPr>
+            <w:tcW w:type="dxa" w:w="1928"/>
+            <w:shd w:val="clear" w:color="auto" w:fill="FFF8E7"/>
+          </w:tcPr>
+          <w:p>
+            <w:pPr>
+              <w:spacing w:after="0"/>
+            </w:pPr>
+            <w:r>
+              <w:rPr>
+                <w:b/>
+                <w:sz w:val="19"/>
+              </w:rPr>
+              <w:t>Lo que debe decir</w:t>
+            </w:r>
+          </w:p>
+        </w:tc>
+        <w:tc>
+          <w:tcPr>
+            <w:tcW w:type="dxa" w:w="7710"/>
+          </w:tcPr>
+          <w:p>
+            <w:pPr>
+              <w:spacing w:after="0"/>
+            </w:pPr>
+            <w:r>
+              <w:rPr>
+                <w:b/>
+                <w:sz w:val="19"/>
+              </w:rPr>
+              <w:t>Usa UNA analogía, la que le quede al cliente, en 2 o 3 frases, y la conecta con lo nuestro. Sección 13 de la base. (1) El nadador: Para bajar un segundo, un nadador nada miles de piscinas de ida y vuelta, y las piscinas se parecen todas. Nadie le dice que es aburrido: es entrenamiento. El video de un minuto todos los días son tus piscinas. (2) Las tablas de multiplicar: Nadie se aprendió las tablas leyéndolas una vez: las repitió cien veces hasta que salieron solas. El inglés es igual: la frase que hoy piensas, mañana te sale sin pensar, y eso solo lo hace la repetición. (3) El de cálculo: Al que entiende cálculo no le bastó ver la clase: hizo cincuenta ejercicios, y en los primeros veinte se equivocó. Aquí cada clase es un ejercicio de hablar, y equivocarse en clase es la forma de no equivocarse en la entrevista. (4) Aprender a manejar: Todos entendimos la teoría de manejar en una tarde, y todos necesitamos semanas de práctica para no pensar en el cambio. Con el inglés pasa lo mismo: la gramática se entiende rápido; hablar sin pensar toma horas de práctica. (5) El músico: Un músico profesional todavía calienta con escalas todos los días, y las escalas no son música. Los audios y videos diarios son tus escalas: nadie los va a aplaudir, pero son los que hacen que después suene. (6) El gimnasio: Nadie cambia el cuerpo en tres visitas al gimnasio, y el que va todos los días sí lo cambia, aunque cada día parezca igual al anterior. Por eso la garantía pide asistencia y constancia: es lo único que ha funcionado siempre.</w:t>
+            </w:r>
+          </w:p>
+        </w:tc>
+      </w:tr>
+    </w:tbl>
+    <w:p>
+      <w:pPr>
+        <w:spacing w:before="40" w:after="40"/>
+      </w:pPr>
+      <w:r>
+        <w:rPr>
+          <w:i/>
+          <w:sz w:val="19"/>
+        </w:rPr>
+        <w:t>Regla para el asistente: una analogía por conversación, nunca dos seguidas; siempre termina en el video diario, la asistencia o la garantía. Sirve igual para la asesora en la cita.</w:t>
+      </w:r>
+    </w:p>
+    <w:p>
+      <w:pPr>
         <w:spacing w:before="200"/>
         <w:jc w:val="center"/>
       </w:pPr>

</xml_diff>